<commit_message>
enhanced landing page and log in design
</commit_message>
<xml_diff>
--- a/bisu_template.docx
+++ b/bisu_template.docx
@@ -21,13 +21,253 @@
         <w:t>{{TITLE}}</w:t>
       </w:r>
     </w:p>
+    <w:p>
+      <w:pPr>
+        <w:rPr>
+          <w:rFonts w:ascii="Arial Narrow" w:hAnsi="Arial Narrow"/>
+          <w:sz w:val="24"/>
+          <w:szCs w:val="24"/>
+        </w:rPr>
+      </w:pPr>
+    </w:p>
+    <w:p>
+      <w:pPr>
+        <w:rPr>
+          <w:rFonts w:ascii="Arial Narrow" w:hAnsi="Arial Narrow"/>
+          <w:sz w:val="24"/>
+          <w:szCs w:val="24"/>
+        </w:rPr>
+      </w:pPr>
+    </w:p>
+    <w:p>
+      <w:pPr>
+        <w:rPr>
+          <w:rFonts w:ascii="Arial Narrow" w:hAnsi="Arial Narrow"/>
+          <w:sz w:val="24"/>
+          <w:szCs w:val="24"/>
+        </w:rPr>
+      </w:pPr>
+    </w:p>
+    <w:p>
+      <w:pPr>
+        <w:rPr>
+          <w:rFonts w:ascii="Arial Narrow" w:hAnsi="Arial Narrow"/>
+          <w:sz w:val="24"/>
+          <w:szCs w:val="24"/>
+        </w:rPr>
+      </w:pPr>
+    </w:p>
+    <w:p>
+      <w:pPr>
+        <w:rPr>
+          <w:rFonts w:ascii="Arial Narrow" w:hAnsi="Arial Narrow"/>
+          <w:sz w:val="24"/>
+          <w:szCs w:val="24"/>
+        </w:rPr>
+      </w:pPr>
+    </w:p>
+    <w:p>
+      <w:pPr>
+        <w:rPr>
+          <w:rFonts w:ascii="Arial Narrow" w:hAnsi="Arial Narrow"/>
+          <w:sz w:val="24"/>
+          <w:szCs w:val="24"/>
+        </w:rPr>
+      </w:pPr>
+    </w:p>
+    <w:p>
+      <w:pPr>
+        <w:rPr>
+          <w:rFonts w:ascii="Arial Narrow" w:hAnsi="Arial Narrow"/>
+          <w:sz w:val="24"/>
+          <w:szCs w:val="24"/>
+        </w:rPr>
+      </w:pPr>
+    </w:p>
+    <w:p>
+      <w:pPr>
+        <w:rPr>
+          <w:rFonts w:ascii="Arial Narrow" w:hAnsi="Arial Narrow"/>
+          <w:sz w:val="24"/>
+          <w:szCs w:val="24"/>
+        </w:rPr>
+      </w:pPr>
+    </w:p>
+    <w:p>
+      <w:pPr>
+        <w:rPr>
+          <w:rFonts w:ascii="Arial Narrow" w:hAnsi="Arial Narrow"/>
+          <w:sz w:val="24"/>
+          <w:szCs w:val="24"/>
+        </w:rPr>
+      </w:pPr>
+    </w:p>
+    <w:p>
+      <w:pPr>
+        <w:rPr>
+          <w:rFonts w:ascii="Arial Narrow" w:hAnsi="Arial Narrow"/>
+          <w:sz w:val="24"/>
+          <w:szCs w:val="24"/>
+        </w:rPr>
+      </w:pPr>
+    </w:p>
+    <w:p>
+      <w:pPr>
+        <w:rPr>
+          <w:rFonts w:ascii="Arial Narrow" w:hAnsi="Arial Narrow"/>
+          <w:sz w:val="24"/>
+          <w:szCs w:val="24"/>
+        </w:rPr>
+      </w:pPr>
+    </w:p>
+    <w:p>
+      <w:pPr>
+        <w:rPr>
+          <w:rFonts w:ascii="Arial Narrow" w:hAnsi="Arial Narrow"/>
+          <w:sz w:val="24"/>
+          <w:szCs w:val="24"/>
+        </w:rPr>
+      </w:pPr>
+    </w:p>
+    <w:p>
+      <w:pPr>
+        <w:rPr>
+          <w:rFonts w:ascii="Arial Narrow" w:hAnsi="Arial Narrow"/>
+          <w:sz w:val="24"/>
+          <w:szCs w:val="24"/>
+        </w:rPr>
+      </w:pPr>
+    </w:p>
+    <w:p>
+      <w:pPr>
+        <w:rPr>
+          <w:rFonts w:ascii="Arial Narrow" w:hAnsi="Arial Narrow"/>
+          <w:sz w:val="24"/>
+          <w:szCs w:val="24"/>
+        </w:rPr>
+      </w:pPr>
+    </w:p>
+    <w:p>
+      <w:pPr>
+        <w:rPr>
+          <w:rFonts w:ascii="Arial Narrow" w:hAnsi="Arial Narrow"/>
+          <w:sz w:val="24"/>
+          <w:szCs w:val="24"/>
+        </w:rPr>
+      </w:pPr>
+    </w:p>
+    <w:p>
+      <w:pPr>
+        <w:rPr>
+          <w:rFonts w:ascii="Arial Narrow" w:hAnsi="Arial Narrow"/>
+          <w:sz w:val="24"/>
+          <w:szCs w:val="24"/>
+        </w:rPr>
+      </w:pPr>
+    </w:p>
+    <w:p>
+      <w:pPr>
+        <w:rPr>
+          <w:rFonts w:ascii="Arial Narrow" w:hAnsi="Arial Narrow"/>
+          <w:sz w:val="24"/>
+          <w:szCs w:val="24"/>
+        </w:rPr>
+      </w:pPr>
+    </w:p>
+    <w:p>
+      <w:pPr>
+        <w:rPr>
+          <w:rFonts w:ascii="Arial Narrow" w:hAnsi="Arial Narrow"/>
+          <w:sz w:val="24"/>
+          <w:szCs w:val="24"/>
+        </w:rPr>
+      </w:pPr>
+    </w:p>
+    <w:p>
+      <w:pPr>
+        <w:rPr>
+          <w:rFonts w:ascii="Arial Narrow" w:hAnsi="Arial Narrow"/>
+          <w:sz w:val="24"/>
+          <w:szCs w:val="24"/>
+        </w:rPr>
+      </w:pPr>
+    </w:p>
+    <w:p>
+      <w:pPr>
+        <w:rPr>
+          <w:rFonts w:ascii="Arial Narrow" w:hAnsi="Arial Narrow"/>
+          <w:sz w:val="24"/>
+          <w:szCs w:val="24"/>
+        </w:rPr>
+      </w:pPr>
+    </w:p>
+    <w:p>
+      <w:pPr>
+        <w:rPr>
+          <w:rFonts w:ascii="Arial Narrow" w:hAnsi="Arial Narrow"/>
+          <w:sz w:val="24"/>
+          <w:szCs w:val="24"/>
+        </w:rPr>
+      </w:pPr>
+    </w:p>
+    <w:p>
+      <w:pPr>
+        <w:rPr>
+          <w:rFonts w:ascii="Arial Narrow" w:hAnsi="Arial Narrow"/>
+          <w:sz w:val="24"/>
+          <w:szCs w:val="24"/>
+        </w:rPr>
+      </w:pPr>
+    </w:p>
+    <w:p>
+      <w:pPr>
+        <w:rPr>
+          <w:rFonts w:ascii="Arial Narrow" w:hAnsi="Arial Narrow"/>
+          <w:sz w:val="24"/>
+          <w:szCs w:val="24"/>
+        </w:rPr>
+      </w:pPr>
+    </w:p>
+    <w:p>
+      <w:pPr>
+        <w:rPr>
+          <w:rFonts w:ascii="Arial Narrow" w:hAnsi="Arial Narrow"/>
+          <w:sz w:val="24"/>
+          <w:szCs w:val="24"/>
+        </w:rPr>
+      </w:pPr>
+    </w:p>
+    <w:p>
+      <w:pPr>
+        <w:rPr>
+          <w:rFonts w:ascii="Arial Narrow" w:hAnsi="Arial Narrow"/>
+          <w:sz w:val="24"/>
+          <w:szCs w:val="24"/>
+        </w:rPr>
+      </w:pPr>
+    </w:p>
+    <w:p>
+      <w:pPr>
+        <w:rPr>
+          <w:rFonts w:ascii="Arial Narrow" w:hAnsi="Arial Narrow"/>
+          <w:sz w:val="24"/>
+          <w:szCs w:val="24"/>
+        </w:rPr>
+      </w:pPr>
+    </w:p>
+    <w:p>
+      <w:pPr>
+        <w:jc w:val="right"/>
+        <w:rPr>
+          <w:rFonts w:ascii="Arial Narrow" w:hAnsi="Arial Narrow"/>
+          <w:sz w:val="24"/>
+          <w:szCs w:val="24"/>
+        </w:rPr>
+      </w:pPr>
+    </w:p>
     <w:sectPr>
-      <w:headerReference w:type="even" r:id="rId8"/>
-      <w:headerReference w:type="default" r:id="rId9"/>
-      <w:footerReference w:type="even" r:id="rId10"/>
-      <w:footerReference w:type="default" r:id="rId11"/>
-      <w:headerReference w:type="first" r:id="rId12"/>
-      <w:footerReference w:type="first" r:id="rId13"/>
+      <w:headerReference w:type="default" r:id="rId8"/>
+      <w:footerReference w:type="default" r:id="rId9"/>
       <w:type w:val="continuous"/>
       <w:pgSz w:w="12240" w:h="15840" w:code="1"/>
       <w:pgMar w:top="720" w:right="720" w:bottom="720" w:left="720" w:header="706" w:footer="706" w:gutter="0"/>
@@ -64,16 +304,6 @@
 </file>
 
 <file path=word/footer1.xml><?xml version="1.0" encoding="utf-8"?>
-<w:ftr xmlns:wpc="http://schemas.microsoft.com/office/word/2010/wordprocessingCanvas" xmlns:cx="http://schemas.microsoft.com/office/drawing/2014/chartex" xmlns:cx1="http://schemas.microsoft.com/office/drawing/2015/9/8/chartex" xmlns:cx2="http://schemas.microsoft.com/office/drawing/2015/10/21/chartex" xmlns:cx3="http://schemas.microsoft.com/office/drawing/2016/5/9/chartex" xmlns:cx4="http://schemas.microsoft.com/office/drawing/2016/5/10/chartex" xmlns:cx5="http://schemas.microsoft.com/office/drawing/2016/5/11/chartex" xmlns:cx6="http://schemas.microsoft.com/office/drawing/2016/5/12/chartex" xmlns:cx7="http://schemas.microsoft.com/office/drawing/2016/5/13/chartex" xmlns:cx8="http://schemas.microsoft.com/office/drawing/2016/5/14/chartex" xmlns:mc="http://schemas.openxmlformats.org/markup-compatibility/2006" xmlns:aink="http://schemas.microsoft.com/office/drawing/2016/ink" xmlns:am3d="http://schemas.microsoft.com/office/drawing/2017/model3d" xmlns:o="urn:schemas-microsoft-com:office:office" xmlns:oel="http://schemas.microsoft.com/office/2019/extlst" xmlns:r="http://schemas.openxmlformats.org/officeDocument/2006/relationships" xmlns:m="http://schemas.openxmlformats.org/officeDocument/2006/math" xmlns:v="urn:schemas-microsoft-com:vml" xmlns:wp14="http://schemas.microsoft.com/office/word/2010/wordprocessingDrawing" xmlns:wp="http://schemas.openxmlformats.org/drawingml/2006/wordprocessingDrawing" xmlns:w10="urn:schemas-microsoft-com:office:word" xmlns:w="http://schemas.openxmlformats.org/wordprocessingml/2006/main" xmlns:w14="http://schemas.microsoft.com/office/word/2010/wordml" xmlns:w15="http://schemas.microsoft.com/office/word/2012/wordml" xmlns:w16cex="http://schemas.microsoft.com/office/word/2018/wordml/cex" xmlns:w16cid="http://schemas.microsoft.com/office/word/2016/wordml/cid" xmlns:w16="http://schemas.microsoft.com/office/word/2018/wordml" xmlns:w16du="http://schemas.microsoft.com/office/word/2023/wordml/word16du" xmlns:w16sdtdh="http://schemas.microsoft.com/office/word/2020/wordml/sdtdatahash" xmlns:w16sdtfl="http://schemas.microsoft.com/office/word/2024/wordml/sdtformatlock" xmlns:w16se="http://schemas.microsoft.com/office/word/2015/wordml/symex" xmlns:wpg="http://schemas.microsoft.com/office/word/2010/wordprocessingGroup" xmlns:wpi="http://schemas.microsoft.com/office/word/2010/wordprocessingInk" xmlns:wne="http://schemas.microsoft.com/office/word/2006/wordml" xmlns:wps="http://schemas.microsoft.com/office/word/2010/wordprocessingShape" mc:Ignorable="w14 w15 w16se w16cid w16 w16cex w16sdtdh w16sdtfl w16du wp14">
-  <w:p>
-    <w:pPr>
-      <w:pStyle w:val="Footer"/>
-    </w:pPr>
-  </w:p>
-</w:ftr>
-</file>
-
-<file path=word/footer2.xml><?xml version="1.0" encoding="utf-8"?>
 <w:ftr xmlns:wpc="http://schemas.microsoft.com/office/word/2010/wordprocessingCanvas" xmlns:cx="http://schemas.microsoft.com/office/drawing/2014/chartex" xmlns:cx1="http://schemas.microsoft.com/office/drawing/2015/9/8/chartex" xmlns:cx2="http://schemas.microsoft.com/office/drawing/2015/10/21/chartex" xmlns:cx3="http://schemas.microsoft.com/office/drawing/2016/5/9/chartex" xmlns:cx4="http://schemas.microsoft.com/office/drawing/2016/5/10/chartex" xmlns:cx5="http://schemas.microsoft.com/office/drawing/2016/5/11/chartex" xmlns:cx6="http://schemas.microsoft.com/office/drawing/2016/5/12/chartex" xmlns:cx7="http://schemas.microsoft.com/office/drawing/2016/5/13/chartex" xmlns:cx8="http://schemas.microsoft.com/office/drawing/2016/5/14/chartex" xmlns:mc="http://schemas.openxmlformats.org/markup-compatibility/2006" xmlns:aink="http://schemas.microsoft.com/office/drawing/2016/ink" xmlns:am3d="http://schemas.microsoft.com/office/drawing/2017/model3d" xmlns:o="urn:schemas-microsoft-com:office:office" xmlns:oel="http://schemas.microsoft.com/office/2019/extlst" xmlns:r="http://schemas.openxmlformats.org/officeDocument/2006/relationships" xmlns:m="http://schemas.openxmlformats.org/officeDocument/2006/math" xmlns:v="urn:schemas-microsoft-com:vml" xmlns:wp14="http://schemas.microsoft.com/office/word/2010/wordprocessingDrawing" xmlns:wp="http://schemas.openxmlformats.org/drawingml/2006/wordprocessingDrawing" xmlns:w10="urn:schemas-microsoft-com:office:word" xmlns:w="http://schemas.openxmlformats.org/wordprocessingml/2006/main" xmlns:w14="http://schemas.microsoft.com/office/word/2010/wordml" xmlns:w15="http://schemas.microsoft.com/office/word/2012/wordml" xmlns:w16cex="http://schemas.microsoft.com/office/word/2018/wordml/cex" xmlns:w16cid="http://schemas.microsoft.com/office/word/2016/wordml/cid" xmlns:w16="http://schemas.microsoft.com/office/word/2018/wordml" xmlns:w16du="http://schemas.microsoft.com/office/word/2023/wordml/word16du" xmlns:w16sdtdh="http://schemas.microsoft.com/office/word/2020/wordml/sdtdatahash" xmlns:w16sdtfl="http://schemas.microsoft.com/office/word/2024/wordml/sdtformatlock" xmlns:w16se="http://schemas.microsoft.com/office/word/2015/wordml/symex" xmlns:wpg="http://schemas.microsoft.com/office/word/2010/wordprocessingGroup" xmlns:wpi="http://schemas.microsoft.com/office/word/2010/wordprocessingInk" xmlns:wne="http://schemas.microsoft.com/office/word/2006/wordml" xmlns:wps="http://schemas.microsoft.com/office/word/2010/wordprocessingShape" mc:Ignorable="w14 w15 w16se w16cid w16 w16cex w16sdtdh w16sdtfl w16du wp14">
   <w:p>
     <w:pPr>
@@ -462,16 +692,6 @@
 </w:ftr>
 </file>
 
-<file path=word/footer3.xml><?xml version="1.0" encoding="utf-8"?>
-<w:ftr xmlns:wpc="http://schemas.microsoft.com/office/word/2010/wordprocessingCanvas" xmlns:cx="http://schemas.microsoft.com/office/drawing/2014/chartex" xmlns:cx1="http://schemas.microsoft.com/office/drawing/2015/9/8/chartex" xmlns:cx2="http://schemas.microsoft.com/office/drawing/2015/10/21/chartex" xmlns:cx3="http://schemas.microsoft.com/office/drawing/2016/5/9/chartex" xmlns:cx4="http://schemas.microsoft.com/office/drawing/2016/5/10/chartex" xmlns:cx5="http://schemas.microsoft.com/office/drawing/2016/5/11/chartex" xmlns:cx6="http://schemas.microsoft.com/office/drawing/2016/5/12/chartex" xmlns:cx7="http://schemas.microsoft.com/office/drawing/2016/5/13/chartex" xmlns:cx8="http://schemas.microsoft.com/office/drawing/2016/5/14/chartex" xmlns:mc="http://schemas.openxmlformats.org/markup-compatibility/2006" xmlns:aink="http://schemas.microsoft.com/office/drawing/2016/ink" xmlns:am3d="http://schemas.microsoft.com/office/drawing/2017/model3d" xmlns:o="urn:schemas-microsoft-com:office:office" xmlns:oel="http://schemas.microsoft.com/office/2019/extlst" xmlns:r="http://schemas.openxmlformats.org/officeDocument/2006/relationships" xmlns:m="http://schemas.openxmlformats.org/officeDocument/2006/math" xmlns:v="urn:schemas-microsoft-com:vml" xmlns:wp14="http://schemas.microsoft.com/office/word/2010/wordprocessingDrawing" xmlns:wp="http://schemas.openxmlformats.org/drawingml/2006/wordprocessingDrawing" xmlns:w10="urn:schemas-microsoft-com:office:word" xmlns:w="http://schemas.openxmlformats.org/wordprocessingml/2006/main" xmlns:w14="http://schemas.microsoft.com/office/word/2010/wordml" xmlns:w15="http://schemas.microsoft.com/office/word/2012/wordml" xmlns:w16cex="http://schemas.microsoft.com/office/word/2018/wordml/cex" xmlns:w16cid="http://schemas.microsoft.com/office/word/2016/wordml/cid" xmlns:w16="http://schemas.microsoft.com/office/word/2018/wordml" xmlns:w16du="http://schemas.microsoft.com/office/word/2023/wordml/word16du" xmlns:w16sdtdh="http://schemas.microsoft.com/office/word/2020/wordml/sdtdatahash" xmlns:w16sdtfl="http://schemas.microsoft.com/office/word/2024/wordml/sdtformatlock" xmlns:w16se="http://schemas.microsoft.com/office/word/2015/wordml/symex" xmlns:wpg="http://schemas.microsoft.com/office/word/2010/wordprocessingGroup" xmlns:wpi="http://schemas.microsoft.com/office/word/2010/wordprocessingInk" xmlns:wne="http://schemas.microsoft.com/office/word/2006/wordml" xmlns:wps="http://schemas.microsoft.com/office/word/2010/wordprocessingShape" mc:Ignorable="w14 w15 w16se w16cid w16 w16cex w16sdtdh w16sdtfl w16du wp14">
-  <w:p>
-    <w:pPr>
-      <w:pStyle w:val="Footer"/>
-    </w:pPr>
-  </w:p>
-</w:ftr>
-</file>
-
 <file path=word/footnotes.xml><?xml version="1.0" encoding="utf-8"?>
 <w:footnotes xmlns:wpc="http://schemas.microsoft.com/office/word/2010/wordprocessingCanvas" xmlns:cx="http://schemas.microsoft.com/office/drawing/2014/chartex" xmlns:cx1="http://schemas.microsoft.com/office/drawing/2015/9/8/chartex" xmlns:cx2="http://schemas.microsoft.com/office/drawing/2015/10/21/chartex" xmlns:cx3="http://schemas.microsoft.com/office/drawing/2016/5/9/chartex" xmlns:cx4="http://schemas.microsoft.com/office/drawing/2016/5/10/chartex" xmlns:cx5="http://schemas.microsoft.com/office/drawing/2016/5/11/chartex" xmlns:cx6="http://schemas.microsoft.com/office/drawing/2016/5/12/chartex" xmlns:cx7="http://schemas.microsoft.com/office/drawing/2016/5/13/chartex" xmlns:cx8="http://schemas.microsoft.com/office/drawing/2016/5/14/chartex" xmlns:mc="http://schemas.openxmlformats.org/markup-compatibility/2006" xmlns:aink="http://schemas.microsoft.com/office/drawing/2016/ink" xmlns:am3d="http://schemas.microsoft.com/office/drawing/2017/model3d" xmlns:o="urn:schemas-microsoft-com:office:office" xmlns:oel="http://schemas.microsoft.com/office/2019/extlst" xmlns:r="http://schemas.openxmlformats.org/officeDocument/2006/relationships" xmlns:m="http://schemas.openxmlformats.org/officeDocument/2006/math" xmlns:v="urn:schemas-microsoft-com:vml" xmlns:wp14="http://schemas.microsoft.com/office/word/2010/wordprocessingDrawing" xmlns:wp="http://schemas.openxmlformats.org/drawingml/2006/wordprocessingDrawing" xmlns:w10="urn:schemas-microsoft-com:office:word" xmlns:w="http://schemas.openxmlformats.org/wordprocessingml/2006/main" xmlns:w14="http://schemas.microsoft.com/office/word/2010/wordml" xmlns:w15="http://schemas.microsoft.com/office/word/2012/wordml" xmlns:w16cex="http://schemas.microsoft.com/office/word/2018/wordml/cex" xmlns:w16cid="http://schemas.microsoft.com/office/word/2016/wordml/cid" xmlns:w16="http://schemas.microsoft.com/office/word/2018/wordml" xmlns:w16du="http://schemas.microsoft.com/office/word/2023/wordml/word16du" xmlns:w16sdtdh="http://schemas.microsoft.com/office/word/2020/wordml/sdtdatahash" xmlns:w16sdtfl="http://schemas.microsoft.com/office/word/2024/wordml/sdtformatlock" xmlns:w16se="http://schemas.microsoft.com/office/word/2015/wordml/symex" xmlns:wpg="http://schemas.microsoft.com/office/word/2010/wordprocessingGroup" xmlns:wpi="http://schemas.microsoft.com/office/word/2010/wordprocessingInk" xmlns:wne="http://schemas.microsoft.com/office/word/2006/wordml" xmlns:wps="http://schemas.microsoft.com/office/word/2010/wordprocessingShape" mc:Ignorable="w14 w15 w16se w16cid w16 w16cex w16sdtdh w16sdtfl w16du wp14">
   <w:footnote w:type="separator" w:id="-1">
@@ -498,16 +718,6 @@
 </file>
 
 <file path=word/header1.xml><?xml version="1.0" encoding="utf-8"?>
-<w:hdr xmlns:wpc="http://schemas.microsoft.com/office/word/2010/wordprocessingCanvas" xmlns:cx="http://schemas.microsoft.com/office/drawing/2014/chartex" xmlns:cx1="http://schemas.microsoft.com/office/drawing/2015/9/8/chartex" xmlns:cx2="http://schemas.microsoft.com/office/drawing/2015/10/21/chartex" xmlns:cx3="http://schemas.microsoft.com/office/drawing/2016/5/9/chartex" xmlns:cx4="http://schemas.microsoft.com/office/drawing/2016/5/10/chartex" xmlns:cx5="http://schemas.microsoft.com/office/drawing/2016/5/11/chartex" xmlns:cx6="http://schemas.microsoft.com/office/drawing/2016/5/12/chartex" xmlns:cx7="http://schemas.microsoft.com/office/drawing/2016/5/13/chartex" xmlns:cx8="http://schemas.microsoft.com/office/drawing/2016/5/14/chartex" xmlns:mc="http://schemas.openxmlformats.org/markup-compatibility/2006" xmlns:aink="http://schemas.microsoft.com/office/drawing/2016/ink" xmlns:am3d="http://schemas.microsoft.com/office/drawing/2017/model3d" xmlns:o="urn:schemas-microsoft-com:office:office" xmlns:oel="http://schemas.microsoft.com/office/2019/extlst" xmlns:r="http://schemas.openxmlformats.org/officeDocument/2006/relationships" xmlns:m="http://schemas.openxmlformats.org/officeDocument/2006/math" xmlns:v="urn:schemas-microsoft-com:vml" xmlns:wp14="http://schemas.microsoft.com/office/word/2010/wordprocessingDrawing" xmlns:wp="http://schemas.openxmlformats.org/drawingml/2006/wordprocessingDrawing" xmlns:w10="urn:schemas-microsoft-com:office:word" xmlns:w="http://schemas.openxmlformats.org/wordprocessingml/2006/main" xmlns:w14="http://schemas.microsoft.com/office/word/2010/wordml" xmlns:w15="http://schemas.microsoft.com/office/word/2012/wordml" xmlns:w16cex="http://schemas.microsoft.com/office/word/2018/wordml/cex" xmlns:w16cid="http://schemas.microsoft.com/office/word/2016/wordml/cid" xmlns:w16="http://schemas.microsoft.com/office/word/2018/wordml" xmlns:w16du="http://schemas.microsoft.com/office/word/2023/wordml/word16du" xmlns:w16sdtdh="http://schemas.microsoft.com/office/word/2020/wordml/sdtdatahash" xmlns:w16sdtfl="http://schemas.microsoft.com/office/word/2024/wordml/sdtformatlock" xmlns:w16se="http://schemas.microsoft.com/office/word/2015/wordml/symex" xmlns:wpg="http://schemas.microsoft.com/office/word/2010/wordprocessingGroup" xmlns:wpi="http://schemas.microsoft.com/office/word/2010/wordprocessingInk" xmlns:wne="http://schemas.microsoft.com/office/word/2006/wordml" xmlns:wps="http://schemas.microsoft.com/office/word/2010/wordprocessingShape" mc:Ignorable="w14 w15 w16se w16cid w16 w16cex w16sdtdh w16sdtfl w16du wp14">
-  <w:p>
-    <w:pPr>
-      <w:pStyle w:val="Header"/>
-    </w:pPr>
-  </w:p>
-</w:hdr>
-</file>
-
-<file path=word/header2.xml><?xml version="1.0" encoding="utf-8"?>
 <w:hdr xmlns:wpc="http://schemas.microsoft.com/office/word/2010/wordprocessingCanvas" xmlns:cx="http://schemas.microsoft.com/office/drawing/2014/chartex" xmlns:cx1="http://schemas.microsoft.com/office/drawing/2015/9/8/chartex" xmlns:cx2="http://schemas.microsoft.com/office/drawing/2015/10/21/chartex" xmlns:cx3="http://schemas.microsoft.com/office/drawing/2016/5/9/chartex" xmlns:cx4="http://schemas.microsoft.com/office/drawing/2016/5/10/chartex" xmlns:cx5="http://schemas.microsoft.com/office/drawing/2016/5/11/chartex" xmlns:cx6="http://schemas.microsoft.com/office/drawing/2016/5/12/chartex" xmlns:cx7="http://schemas.microsoft.com/office/drawing/2016/5/13/chartex" xmlns:cx8="http://schemas.microsoft.com/office/drawing/2016/5/14/chartex" xmlns:mc="http://schemas.openxmlformats.org/markup-compatibility/2006" xmlns:aink="http://schemas.microsoft.com/office/drawing/2016/ink" xmlns:am3d="http://schemas.microsoft.com/office/drawing/2017/model3d" xmlns:o="urn:schemas-microsoft-com:office:office" xmlns:oel="http://schemas.microsoft.com/office/2019/extlst" xmlns:r="http://schemas.openxmlformats.org/officeDocument/2006/relationships" xmlns:m="http://schemas.openxmlformats.org/officeDocument/2006/math" xmlns:v="urn:schemas-microsoft-com:vml" xmlns:wp14="http://schemas.microsoft.com/office/word/2010/wordprocessingDrawing" xmlns:wp="http://schemas.openxmlformats.org/drawingml/2006/wordprocessingDrawing" xmlns:w10="urn:schemas-microsoft-com:office:word" xmlns:w="http://schemas.openxmlformats.org/wordprocessingml/2006/main" xmlns:w14="http://schemas.microsoft.com/office/word/2010/wordml" xmlns:w15="http://schemas.microsoft.com/office/word/2012/wordml" xmlns:w16cex="http://schemas.microsoft.com/office/word/2018/wordml/cex" xmlns:w16cid="http://schemas.microsoft.com/office/word/2016/wordml/cid" xmlns:w16="http://schemas.microsoft.com/office/word/2018/wordml" xmlns:w16du="http://schemas.microsoft.com/office/word/2023/wordml/word16du" xmlns:w16sdtdh="http://schemas.microsoft.com/office/word/2020/wordml/sdtdatahash" xmlns:w16sdtfl="http://schemas.microsoft.com/office/word/2024/wordml/sdtformatlock" xmlns:w16se="http://schemas.microsoft.com/office/word/2015/wordml/symex" xmlns:wpg="http://schemas.microsoft.com/office/word/2010/wordprocessingGroup" xmlns:wpi="http://schemas.microsoft.com/office/word/2010/wordprocessingInk" xmlns:wne="http://schemas.microsoft.com/office/word/2006/wordml" xmlns:wps="http://schemas.microsoft.com/office/word/2010/wordprocessingShape" mc:Ignorable="w14 w15 w16se w16cid w16 w16cex w16sdtdh w16sdtfl w16du wp14">
   <w:p>
     <w:pPr>
@@ -1097,16 +1307,6 @@
       </w:rPr>
       <w:t>prightness</w:t>
     </w:r>
-  </w:p>
-</w:hdr>
-</file>
-
-<file path=word/header3.xml><?xml version="1.0" encoding="utf-8"?>
-<w:hdr xmlns:wpc="http://schemas.microsoft.com/office/word/2010/wordprocessingCanvas" xmlns:cx="http://schemas.microsoft.com/office/drawing/2014/chartex" xmlns:cx1="http://schemas.microsoft.com/office/drawing/2015/9/8/chartex" xmlns:cx2="http://schemas.microsoft.com/office/drawing/2015/10/21/chartex" xmlns:cx3="http://schemas.microsoft.com/office/drawing/2016/5/9/chartex" xmlns:cx4="http://schemas.microsoft.com/office/drawing/2016/5/10/chartex" xmlns:cx5="http://schemas.microsoft.com/office/drawing/2016/5/11/chartex" xmlns:cx6="http://schemas.microsoft.com/office/drawing/2016/5/12/chartex" xmlns:cx7="http://schemas.microsoft.com/office/drawing/2016/5/13/chartex" xmlns:cx8="http://schemas.microsoft.com/office/drawing/2016/5/14/chartex" xmlns:mc="http://schemas.openxmlformats.org/markup-compatibility/2006" xmlns:aink="http://schemas.microsoft.com/office/drawing/2016/ink" xmlns:am3d="http://schemas.microsoft.com/office/drawing/2017/model3d" xmlns:o="urn:schemas-microsoft-com:office:office" xmlns:oel="http://schemas.microsoft.com/office/2019/extlst" xmlns:r="http://schemas.openxmlformats.org/officeDocument/2006/relationships" xmlns:m="http://schemas.openxmlformats.org/officeDocument/2006/math" xmlns:v="urn:schemas-microsoft-com:vml" xmlns:wp14="http://schemas.microsoft.com/office/word/2010/wordprocessingDrawing" xmlns:wp="http://schemas.openxmlformats.org/drawingml/2006/wordprocessingDrawing" xmlns:w10="urn:schemas-microsoft-com:office:word" xmlns:w="http://schemas.openxmlformats.org/wordprocessingml/2006/main" xmlns:w14="http://schemas.microsoft.com/office/word/2010/wordml" xmlns:w15="http://schemas.microsoft.com/office/word/2012/wordml" xmlns:w16cex="http://schemas.microsoft.com/office/word/2018/wordml/cex" xmlns:w16cid="http://schemas.microsoft.com/office/word/2016/wordml/cid" xmlns:w16="http://schemas.microsoft.com/office/word/2018/wordml" xmlns:w16du="http://schemas.microsoft.com/office/word/2023/wordml/word16du" xmlns:w16sdtdh="http://schemas.microsoft.com/office/word/2020/wordml/sdtdatahash" xmlns:w16sdtfl="http://schemas.microsoft.com/office/word/2024/wordml/sdtformatlock" xmlns:w16se="http://schemas.microsoft.com/office/word/2015/wordml/symex" xmlns:wpg="http://schemas.microsoft.com/office/word/2010/wordprocessingGroup" xmlns:wpi="http://schemas.microsoft.com/office/word/2010/wordprocessingInk" xmlns:wne="http://schemas.microsoft.com/office/word/2006/wordml" xmlns:wps="http://schemas.microsoft.com/office/word/2010/wordprocessingShape" mc:Ignorable="w14 w15 w16se w16cid w16 w16cex w16sdtdh w16sdtfl w16du wp14">
-  <w:p>
-    <w:pPr>
-      <w:pStyle w:val="Header"/>
-    </w:pPr>
   </w:p>
 </w:hdr>
 </file>

</xml_diff>

<commit_message>
succesfully fixed the bug of this shit
</commit_message>
<xml_diff>
--- a/bisu_template.docx
+++ b/bisu_template.docx
@@ -20,250 +20,6 @@
         </w:rPr>
         <w:t>{{TITLE}}</w:t>
       </w:r>
-    </w:p>
-    <w:p>
-      <w:pPr>
-        <w:rPr>
-          <w:rFonts w:ascii="Arial Narrow" w:hAnsi="Arial Narrow"/>
-          <w:sz w:val="24"/>
-          <w:szCs w:val="24"/>
-        </w:rPr>
-      </w:pPr>
-    </w:p>
-    <w:p>
-      <w:pPr>
-        <w:rPr>
-          <w:rFonts w:ascii="Arial Narrow" w:hAnsi="Arial Narrow"/>
-          <w:sz w:val="24"/>
-          <w:szCs w:val="24"/>
-        </w:rPr>
-      </w:pPr>
-    </w:p>
-    <w:p>
-      <w:pPr>
-        <w:rPr>
-          <w:rFonts w:ascii="Arial Narrow" w:hAnsi="Arial Narrow"/>
-          <w:sz w:val="24"/>
-          <w:szCs w:val="24"/>
-        </w:rPr>
-      </w:pPr>
-    </w:p>
-    <w:p>
-      <w:pPr>
-        <w:rPr>
-          <w:rFonts w:ascii="Arial Narrow" w:hAnsi="Arial Narrow"/>
-          <w:sz w:val="24"/>
-          <w:szCs w:val="24"/>
-        </w:rPr>
-      </w:pPr>
-    </w:p>
-    <w:p>
-      <w:pPr>
-        <w:rPr>
-          <w:rFonts w:ascii="Arial Narrow" w:hAnsi="Arial Narrow"/>
-          <w:sz w:val="24"/>
-          <w:szCs w:val="24"/>
-        </w:rPr>
-      </w:pPr>
-    </w:p>
-    <w:p>
-      <w:pPr>
-        <w:rPr>
-          <w:rFonts w:ascii="Arial Narrow" w:hAnsi="Arial Narrow"/>
-          <w:sz w:val="24"/>
-          <w:szCs w:val="24"/>
-        </w:rPr>
-      </w:pPr>
-    </w:p>
-    <w:p>
-      <w:pPr>
-        <w:rPr>
-          <w:rFonts w:ascii="Arial Narrow" w:hAnsi="Arial Narrow"/>
-          <w:sz w:val="24"/>
-          <w:szCs w:val="24"/>
-        </w:rPr>
-      </w:pPr>
-    </w:p>
-    <w:p>
-      <w:pPr>
-        <w:rPr>
-          <w:rFonts w:ascii="Arial Narrow" w:hAnsi="Arial Narrow"/>
-          <w:sz w:val="24"/>
-          <w:szCs w:val="24"/>
-        </w:rPr>
-      </w:pPr>
-    </w:p>
-    <w:p>
-      <w:pPr>
-        <w:rPr>
-          <w:rFonts w:ascii="Arial Narrow" w:hAnsi="Arial Narrow"/>
-          <w:sz w:val="24"/>
-          <w:szCs w:val="24"/>
-        </w:rPr>
-      </w:pPr>
-    </w:p>
-    <w:p>
-      <w:pPr>
-        <w:rPr>
-          <w:rFonts w:ascii="Arial Narrow" w:hAnsi="Arial Narrow"/>
-          <w:sz w:val="24"/>
-          <w:szCs w:val="24"/>
-        </w:rPr>
-      </w:pPr>
-    </w:p>
-    <w:p>
-      <w:pPr>
-        <w:rPr>
-          <w:rFonts w:ascii="Arial Narrow" w:hAnsi="Arial Narrow"/>
-          <w:sz w:val="24"/>
-          <w:szCs w:val="24"/>
-        </w:rPr>
-      </w:pPr>
-    </w:p>
-    <w:p>
-      <w:pPr>
-        <w:rPr>
-          <w:rFonts w:ascii="Arial Narrow" w:hAnsi="Arial Narrow"/>
-          <w:sz w:val="24"/>
-          <w:szCs w:val="24"/>
-        </w:rPr>
-      </w:pPr>
-    </w:p>
-    <w:p>
-      <w:pPr>
-        <w:rPr>
-          <w:rFonts w:ascii="Arial Narrow" w:hAnsi="Arial Narrow"/>
-          <w:sz w:val="24"/>
-          <w:szCs w:val="24"/>
-        </w:rPr>
-      </w:pPr>
-    </w:p>
-    <w:p>
-      <w:pPr>
-        <w:rPr>
-          <w:rFonts w:ascii="Arial Narrow" w:hAnsi="Arial Narrow"/>
-          <w:sz w:val="24"/>
-          <w:szCs w:val="24"/>
-        </w:rPr>
-      </w:pPr>
-    </w:p>
-    <w:p>
-      <w:pPr>
-        <w:rPr>
-          <w:rFonts w:ascii="Arial Narrow" w:hAnsi="Arial Narrow"/>
-          <w:sz w:val="24"/>
-          <w:szCs w:val="24"/>
-        </w:rPr>
-      </w:pPr>
-    </w:p>
-    <w:p>
-      <w:pPr>
-        <w:rPr>
-          <w:rFonts w:ascii="Arial Narrow" w:hAnsi="Arial Narrow"/>
-          <w:sz w:val="24"/>
-          <w:szCs w:val="24"/>
-        </w:rPr>
-      </w:pPr>
-    </w:p>
-    <w:p>
-      <w:pPr>
-        <w:rPr>
-          <w:rFonts w:ascii="Arial Narrow" w:hAnsi="Arial Narrow"/>
-          <w:sz w:val="24"/>
-          <w:szCs w:val="24"/>
-        </w:rPr>
-      </w:pPr>
-    </w:p>
-    <w:p>
-      <w:pPr>
-        <w:rPr>
-          <w:rFonts w:ascii="Arial Narrow" w:hAnsi="Arial Narrow"/>
-          <w:sz w:val="24"/>
-          <w:szCs w:val="24"/>
-        </w:rPr>
-      </w:pPr>
-    </w:p>
-    <w:p>
-      <w:pPr>
-        <w:rPr>
-          <w:rFonts w:ascii="Arial Narrow" w:hAnsi="Arial Narrow"/>
-          <w:sz w:val="24"/>
-          <w:szCs w:val="24"/>
-        </w:rPr>
-      </w:pPr>
-    </w:p>
-    <w:p>
-      <w:pPr>
-        <w:rPr>
-          <w:rFonts w:ascii="Arial Narrow" w:hAnsi="Arial Narrow"/>
-          <w:sz w:val="24"/>
-          <w:szCs w:val="24"/>
-        </w:rPr>
-      </w:pPr>
-    </w:p>
-    <w:p>
-      <w:pPr>
-        <w:rPr>
-          <w:rFonts w:ascii="Arial Narrow" w:hAnsi="Arial Narrow"/>
-          <w:sz w:val="24"/>
-          <w:szCs w:val="24"/>
-        </w:rPr>
-      </w:pPr>
-    </w:p>
-    <w:p>
-      <w:pPr>
-        <w:rPr>
-          <w:rFonts w:ascii="Arial Narrow" w:hAnsi="Arial Narrow"/>
-          <w:sz w:val="24"/>
-          <w:szCs w:val="24"/>
-        </w:rPr>
-      </w:pPr>
-    </w:p>
-    <w:p>
-      <w:pPr>
-        <w:rPr>
-          <w:rFonts w:ascii="Arial Narrow" w:hAnsi="Arial Narrow"/>
-          <w:sz w:val="24"/>
-          <w:szCs w:val="24"/>
-        </w:rPr>
-      </w:pPr>
-    </w:p>
-    <w:p>
-      <w:pPr>
-        <w:rPr>
-          <w:rFonts w:ascii="Arial Narrow" w:hAnsi="Arial Narrow"/>
-          <w:sz w:val="24"/>
-          <w:szCs w:val="24"/>
-        </w:rPr>
-      </w:pPr>
-    </w:p>
-    <w:p>
-      <w:pPr>
-        <w:rPr>
-          <w:rFonts w:ascii="Arial Narrow" w:hAnsi="Arial Narrow"/>
-          <w:sz w:val="24"/>
-          <w:szCs w:val="24"/>
-        </w:rPr>
-      </w:pPr>
-    </w:p>
-    <w:p>
-      <w:pPr>
-        <w:rPr>
-          <w:rFonts w:ascii="Arial Narrow" w:hAnsi="Arial Narrow"/>
-          <w:sz w:val="24"/>
-          <w:szCs w:val="24"/>
-        </w:rPr>
-      </w:pPr>
-    </w:p>
-    <w:p>
-      <w:pPr>
-        <w:jc w:val="right"/>
-        <w:rPr>
-          <w:rFonts w:ascii="Arial Narrow" w:hAnsi="Arial Narrow"/>
-          <w:sz w:val="24"/>
-          <w:szCs w:val="24"/>
-        </w:rPr>
-      </w:pPr>
     </w:p>
     <w:sectPr>
       <w:headerReference w:type="default" r:id="rId8"/>

</xml_diff>

<commit_message>
update code before using pro claude
</commit_message>
<xml_diff>
--- a/bisu_template.docx
+++ b/bisu_template.docx
@@ -21,9 +21,267 @@
         <w:t>{{TITLE}}</w:t>
       </w:r>
     </w:p>
+    <w:p>
+      <w:pPr>
+        <w:rPr>
+          <w:rFonts w:ascii="Arial Narrow" w:hAnsi="Arial Narrow"/>
+          <w:sz w:val="24"/>
+          <w:szCs w:val="24"/>
+        </w:rPr>
+      </w:pPr>
+    </w:p>
+    <w:p>
+      <w:pPr>
+        <w:rPr>
+          <w:rFonts w:ascii="Arial Narrow" w:hAnsi="Arial Narrow"/>
+          <w:sz w:val="24"/>
+          <w:szCs w:val="24"/>
+        </w:rPr>
+      </w:pPr>
+    </w:p>
+    <w:p>
+      <w:pPr>
+        <w:rPr>
+          <w:rFonts w:ascii="Arial Narrow" w:hAnsi="Arial Narrow"/>
+          <w:sz w:val="24"/>
+          <w:szCs w:val="24"/>
+        </w:rPr>
+      </w:pPr>
+    </w:p>
+    <w:p>
+      <w:pPr>
+        <w:rPr>
+          <w:rFonts w:ascii="Arial Narrow" w:hAnsi="Arial Narrow"/>
+          <w:sz w:val="24"/>
+          <w:szCs w:val="24"/>
+        </w:rPr>
+      </w:pPr>
+    </w:p>
+    <w:p>
+      <w:pPr>
+        <w:rPr>
+          <w:rFonts w:ascii="Arial Narrow" w:hAnsi="Arial Narrow"/>
+          <w:sz w:val="24"/>
+          <w:szCs w:val="24"/>
+        </w:rPr>
+      </w:pPr>
+    </w:p>
+    <w:p>
+      <w:pPr>
+        <w:rPr>
+          <w:rFonts w:ascii="Arial Narrow" w:hAnsi="Arial Narrow"/>
+          <w:sz w:val="24"/>
+          <w:szCs w:val="24"/>
+        </w:rPr>
+      </w:pPr>
+    </w:p>
+    <w:p>
+      <w:pPr>
+        <w:rPr>
+          <w:rFonts w:ascii="Arial Narrow" w:hAnsi="Arial Narrow"/>
+          <w:sz w:val="24"/>
+          <w:szCs w:val="24"/>
+        </w:rPr>
+      </w:pPr>
+    </w:p>
+    <w:p>
+      <w:pPr>
+        <w:rPr>
+          <w:rFonts w:ascii="Arial Narrow" w:hAnsi="Arial Narrow"/>
+          <w:sz w:val="24"/>
+          <w:szCs w:val="24"/>
+        </w:rPr>
+      </w:pPr>
+    </w:p>
+    <w:p>
+      <w:pPr>
+        <w:rPr>
+          <w:rFonts w:ascii="Arial Narrow" w:hAnsi="Arial Narrow"/>
+          <w:sz w:val="24"/>
+          <w:szCs w:val="24"/>
+        </w:rPr>
+      </w:pPr>
+    </w:p>
+    <w:p>
+      <w:pPr>
+        <w:rPr>
+          <w:rFonts w:ascii="Arial Narrow" w:hAnsi="Arial Narrow"/>
+          <w:sz w:val="24"/>
+          <w:szCs w:val="24"/>
+        </w:rPr>
+      </w:pPr>
+    </w:p>
+    <w:p>
+      <w:pPr>
+        <w:rPr>
+          <w:rFonts w:ascii="Arial Narrow" w:hAnsi="Arial Narrow"/>
+          <w:sz w:val="24"/>
+          <w:szCs w:val="24"/>
+        </w:rPr>
+      </w:pPr>
+    </w:p>
+    <w:p>
+      <w:pPr>
+        <w:rPr>
+          <w:rFonts w:ascii="Arial Narrow" w:hAnsi="Arial Narrow"/>
+          <w:sz w:val="24"/>
+          <w:szCs w:val="24"/>
+        </w:rPr>
+      </w:pPr>
+    </w:p>
+    <w:p>
+      <w:pPr>
+        <w:rPr>
+          <w:rFonts w:ascii="Arial Narrow" w:hAnsi="Arial Narrow"/>
+          <w:sz w:val="24"/>
+          <w:szCs w:val="24"/>
+        </w:rPr>
+      </w:pPr>
+    </w:p>
+    <w:p>
+      <w:pPr>
+        <w:rPr>
+          <w:rFonts w:ascii="Arial Narrow" w:hAnsi="Arial Narrow"/>
+          <w:sz w:val="24"/>
+          <w:szCs w:val="24"/>
+        </w:rPr>
+      </w:pPr>
+    </w:p>
+    <w:p>
+      <w:pPr>
+        <w:rPr>
+          <w:rFonts w:ascii="Arial Narrow" w:hAnsi="Arial Narrow"/>
+          <w:sz w:val="24"/>
+          <w:szCs w:val="24"/>
+        </w:rPr>
+      </w:pPr>
+    </w:p>
+    <w:p>
+      <w:pPr>
+        <w:rPr>
+          <w:rFonts w:ascii="Arial Narrow" w:hAnsi="Arial Narrow"/>
+          <w:sz w:val="24"/>
+          <w:szCs w:val="24"/>
+        </w:rPr>
+      </w:pPr>
+    </w:p>
+    <w:p>
+      <w:pPr>
+        <w:rPr>
+          <w:rFonts w:ascii="Arial Narrow" w:hAnsi="Arial Narrow"/>
+          <w:sz w:val="24"/>
+          <w:szCs w:val="24"/>
+        </w:rPr>
+      </w:pPr>
+    </w:p>
+    <w:p>
+      <w:pPr>
+        <w:rPr>
+          <w:rFonts w:ascii="Arial Narrow" w:hAnsi="Arial Narrow"/>
+          <w:sz w:val="24"/>
+          <w:szCs w:val="24"/>
+        </w:rPr>
+      </w:pPr>
+    </w:p>
+    <w:p>
+      <w:pPr>
+        <w:rPr>
+          <w:rFonts w:ascii="Arial Narrow" w:hAnsi="Arial Narrow"/>
+          <w:sz w:val="24"/>
+          <w:szCs w:val="24"/>
+        </w:rPr>
+      </w:pPr>
+    </w:p>
+    <w:p>
+      <w:pPr>
+        <w:rPr>
+          <w:rFonts w:ascii="Arial Narrow" w:hAnsi="Arial Narrow"/>
+          <w:sz w:val="24"/>
+          <w:szCs w:val="24"/>
+        </w:rPr>
+      </w:pPr>
+    </w:p>
+    <w:p>
+      <w:pPr>
+        <w:rPr>
+          <w:rFonts w:ascii="Arial Narrow" w:hAnsi="Arial Narrow"/>
+          <w:sz w:val="24"/>
+          <w:szCs w:val="24"/>
+        </w:rPr>
+      </w:pPr>
+    </w:p>
+    <w:p>
+      <w:pPr>
+        <w:rPr>
+          <w:rFonts w:ascii="Arial Narrow" w:hAnsi="Arial Narrow"/>
+          <w:sz w:val="24"/>
+          <w:szCs w:val="24"/>
+        </w:rPr>
+      </w:pPr>
+    </w:p>
+    <w:p>
+      <w:pPr>
+        <w:rPr>
+          <w:rFonts w:ascii="Arial Narrow" w:hAnsi="Arial Narrow"/>
+          <w:sz w:val="24"/>
+          <w:szCs w:val="24"/>
+        </w:rPr>
+      </w:pPr>
+    </w:p>
+    <w:p>
+      <w:pPr>
+        <w:rPr>
+          <w:rFonts w:ascii="Arial Narrow" w:hAnsi="Arial Narrow"/>
+          <w:sz w:val="24"/>
+          <w:szCs w:val="24"/>
+        </w:rPr>
+      </w:pPr>
+    </w:p>
+    <w:p>
+      <w:pPr>
+        <w:rPr>
+          <w:rFonts w:ascii="Arial Narrow" w:hAnsi="Arial Narrow"/>
+          <w:sz w:val="24"/>
+          <w:szCs w:val="24"/>
+        </w:rPr>
+      </w:pPr>
+    </w:p>
+    <w:p>
+      <w:pPr>
+        <w:rPr>
+          <w:rFonts w:ascii="Arial Narrow" w:hAnsi="Arial Narrow"/>
+          <w:sz w:val="24"/>
+          <w:szCs w:val="24"/>
+        </w:rPr>
+      </w:pPr>
+    </w:p>
+    <w:p>
+      <w:pPr>
+        <w:tabs>
+          <w:tab w:val="left" w:pos="7154"/>
+        </w:tabs>
+        <w:rPr>
+          <w:rFonts w:ascii="Arial Narrow" w:hAnsi="Arial Narrow"/>
+          <w:sz w:val="24"/>
+          <w:szCs w:val="24"/>
+        </w:rPr>
+      </w:pPr>
+      <w:r>
+        <w:rPr>
+          <w:rFonts w:ascii="Arial Narrow" w:hAnsi="Arial Narrow"/>
+          <w:sz w:val="24"/>
+          <w:szCs w:val="24"/>
+        </w:rPr>
+        <w:tab/>
+      </w:r>
+    </w:p>
     <w:sectPr>
-      <w:headerReference w:type="default" r:id="rId8"/>
-      <w:footerReference w:type="default" r:id="rId9"/>
+      <w:headerReference w:type="even" r:id="rId8"/>
+      <w:headerReference w:type="default" r:id="rId9"/>
+      <w:footerReference w:type="even" r:id="rId10"/>
+      <w:footerReference w:type="default" r:id="rId11"/>
+      <w:headerReference w:type="first" r:id="rId12"/>
+      <w:footerReference w:type="first" r:id="rId13"/>
       <w:type w:val="continuous"/>
       <w:pgSz w:w="12240" w:h="15840" w:code="1"/>
       <w:pgMar w:top="720" w:right="720" w:bottom="720" w:left="720" w:header="706" w:footer="706" w:gutter="0"/>
@@ -64,6 +322,17 @@
   <w:p>
     <w:pPr>
       <w:pStyle w:val="Footer"/>
+    </w:pPr>
+  </w:p>
+</w:ftr>
+</file>
+
+<file path=word/footer2.xml><?xml version="1.0" encoding="utf-8"?>
+<w:ftr xmlns:wpc="http://schemas.microsoft.com/office/word/2010/wordprocessingCanvas" xmlns:cx="http://schemas.microsoft.com/office/drawing/2014/chartex" xmlns:cx1="http://schemas.microsoft.com/office/drawing/2015/9/8/chartex" xmlns:cx2="http://schemas.microsoft.com/office/drawing/2015/10/21/chartex" xmlns:cx3="http://schemas.microsoft.com/office/drawing/2016/5/9/chartex" xmlns:cx4="http://schemas.microsoft.com/office/drawing/2016/5/10/chartex" xmlns:cx5="http://schemas.microsoft.com/office/drawing/2016/5/11/chartex" xmlns:cx6="http://schemas.microsoft.com/office/drawing/2016/5/12/chartex" xmlns:cx7="http://schemas.microsoft.com/office/drawing/2016/5/13/chartex" xmlns:cx8="http://schemas.microsoft.com/office/drawing/2016/5/14/chartex" xmlns:mc="http://schemas.openxmlformats.org/markup-compatibility/2006" xmlns:aink="http://schemas.microsoft.com/office/drawing/2016/ink" xmlns:am3d="http://schemas.microsoft.com/office/drawing/2017/model3d" xmlns:o="urn:schemas-microsoft-com:office:office" xmlns:oel="http://schemas.microsoft.com/office/2019/extlst" xmlns:r="http://schemas.openxmlformats.org/officeDocument/2006/relationships" xmlns:m="http://schemas.openxmlformats.org/officeDocument/2006/math" xmlns:v="urn:schemas-microsoft-com:vml" xmlns:wp14="http://schemas.microsoft.com/office/word/2010/wordprocessingDrawing" xmlns:wp="http://schemas.openxmlformats.org/drawingml/2006/wordprocessingDrawing" xmlns:w10="urn:schemas-microsoft-com:office:word" xmlns:w="http://schemas.openxmlformats.org/wordprocessingml/2006/main" xmlns:w14="http://schemas.microsoft.com/office/word/2010/wordml" xmlns:w15="http://schemas.microsoft.com/office/word/2012/wordml" xmlns:w16cex="http://schemas.microsoft.com/office/word/2018/wordml/cex" xmlns:w16cid="http://schemas.microsoft.com/office/word/2016/wordml/cid" xmlns:w16="http://schemas.microsoft.com/office/word/2018/wordml" xmlns:w16du="http://schemas.microsoft.com/office/word/2023/wordml/word16du" xmlns:w16sdtdh="http://schemas.microsoft.com/office/word/2020/wordml/sdtdatahash" xmlns:w16sdtfl="http://schemas.microsoft.com/office/word/2024/wordml/sdtformatlock" xmlns:w16se="http://schemas.microsoft.com/office/word/2015/wordml/symex" xmlns:wpg="http://schemas.microsoft.com/office/word/2010/wordprocessingGroup" xmlns:wpi="http://schemas.microsoft.com/office/word/2010/wordprocessingInk" xmlns:wne="http://schemas.microsoft.com/office/word/2006/wordml" xmlns:wps="http://schemas.microsoft.com/office/word/2010/wordprocessingShape" mc:Ignorable="w14 w15 w16se w16cid w16 w16cex w16sdtdh w16sdtfl w16du wp14">
+  <w:p>
+    <w:pPr>
+      <w:pStyle w:val="Footer"/>
+      <w:jc w:val="center"/>
       <w:rPr>
         <w:rFonts w:ascii="Arial Narrow" w:hAnsi="Arial Narrow"/>
         <w:sz w:val="20"/>
@@ -202,7 +471,7 @@
         <w:sz w:val="20"/>
         <w:szCs w:val="20"/>
       </w:rPr>
-      <w:t xml:space="preserve">  SY. 2025 </w:t>
+      <w:t xml:space="preserve">  </w:t>
     </w:r>
     <w:r>
       <w:rPr>
@@ -210,41 +479,7 @@
         <w:sz w:val="20"/>
         <w:szCs w:val="20"/>
       </w:rPr>
-      <w:t>–</w:t>
-    </w:r>
-    <w:r>
-      <w:rPr>
-        <w:rFonts w:ascii="Arial Narrow" w:hAnsi="Arial Narrow"/>
-        <w:sz w:val="20"/>
-        <w:szCs w:val="20"/>
-      </w:rPr>
-      <w:t xml:space="preserve"> </w:t>
-    </w:r>
-    <w:proofErr w:type="gramStart"/>
-    <w:r>
-      <w:rPr>
-        <w:rFonts w:ascii="Arial Narrow" w:hAnsi="Arial Narrow"/>
-        <w:sz w:val="20"/>
-        <w:szCs w:val="20"/>
-      </w:rPr>
-      <w:t>2026</w:t>
-    </w:r>
-    <w:r>
-      <w:rPr>
-        <w:rFonts w:ascii="Arial Narrow" w:hAnsi="Arial Narrow"/>
-        <w:sz w:val="20"/>
-        <w:szCs w:val="20"/>
-      </w:rPr>
-      <w:t xml:space="preserve">  |</w:t>
-    </w:r>
-    <w:proofErr w:type="gramEnd"/>
-    <w:r>
-      <w:rPr>
-        <w:rFonts w:ascii="Arial Narrow" w:hAnsi="Arial Narrow"/>
-        <w:sz w:val="20"/>
-        <w:szCs w:val="20"/>
-      </w:rPr>
-      <w:t xml:space="preserve">  Prepared by: </w:t>
+      <w:t xml:space="preserve">Prepared by: </w:t>
     </w:r>
     <w:r>
       <w:rPr>
@@ -308,6 +543,14 @@
             </w:docPartObj>
           </w:sdtPr>
           <w:sdtContent>
+            <w:r>
+              <w:rPr>
+                <w:rFonts w:ascii="Arial Narrow" w:hAnsi="Arial Narrow"/>
+                <w:sz w:val="20"/>
+                <w:szCs w:val="20"/>
+              </w:rPr>
+              <w:t xml:space="preserve">                                   </w:t>
+            </w:r>
             <w:r>
               <w:rPr>
                 <w:rFonts w:ascii="Arial Narrow" w:hAnsi="Arial Narrow"/>
@@ -448,6 +691,16 @@
 </w:ftr>
 </file>
 
+<file path=word/footer3.xml><?xml version="1.0" encoding="utf-8"?>
+<w:ftr xmlns:wpc="http://schemas.microsoft.com/office/word/2010/wordprocessingCanvas" xmlns:cx="http://schemas.microsoft.com/office/drawing/2014/chartex" xmlns:cx1="http://schemas.microsoft.com/office/drawing/2015/9/8/chartex" xmlns:cx2="http://schemas.microsoft.com/office/drawing/2015/10/21/chartex" xmlns:cx3="http://schemas.microsoft.com/office/drawing/2016/5/9/chartex" xmlns:cx4="http://schemas.microsoft.com/office/drawing/2016/5/10/chartex" xmlns:cx5="http://schemas.microsoft.com/office/drawing/2016/5/11/chartex" xmlns:cx6="http://schemas.microsoft.com/office/drawing/2016/5/12/chartex" xmlns:cx7="http://schemas.microsoft.com/office/drawing/2016/5/13/chartex" xmlns:cx8="http://schemas.microsoft.com/office/drawing/2016/5/14/chartex" xmlns:mc="http://schemas.openxmlformats.org/markup-compatibility/2006" xmlns:aink="http://schemas.microsoft.com/office/drawing/2016/ink" xmlns:am3d="http://schemas.microsoft.com/office/drawing/2017/model3d" xmlns:o="urn:schemas-microsoft-com:office:office" xmlns:oel="http://schemas.microsoft.com/office/2019/extlst" xmlns:r="http://schemas.openxmlformats.org/officeDocument/2006/relationships" xmlns:m="http://schemas.openxmlformats.org/officeDocument/2006/math" xmlns:v="urn:schemas-microsoft-com:vml" xmlns:wp14="http://schemas.microsoft.com/office/word/2010/wordprocessingDrawing" xmlns:wp="http://schemas.openxmlformats.org/drawingml/2006/wordprocessingDrawing" xmlns:w10="urn:schemas-microsoft-com:office:word" xmlns:w="http://schemas.openxmlformats.org/wordprocessingml/2006/main" xmlns:w14="http://schemas.microsoft.com/office/word/2010/wordml" xmlns:w15="http://schemas.microsoft.com/office/word/2012/wordml" xmlns:w16cex="http://schemas.microsoft.com/office/word/2018/wordml/cex" xmlns:w16cid="http://schemas.microsoft.com/office/word/2016/wordml/cid" xmlns:w16="http://schemas.microsoft.com/office/word/2018/wordml" xmlns:w16du="http://schemas.microsoft.com/office/word/2023/wordml/word16du" xmlns:w16sdtdh="http://schemas.microsoft.com/office/word/2020/wordml/sdtdatahash" xmlns:w16sdtfl="http://schemas.microsoft.com/office/word/2024/wordml/sdtformatlock" xmlns:w16se="http://schemas.microsoft.com/office/word/2015/wordml/symex" xmlns:wpg="http://schemas.microsoft.com/office/word/2010/wordprocessingGroup" xmlns:wpi="http://schemas.microsoft.com/office/word/2010/wordprocessingInk" xmlns:wne="http://schemas.microsoft.com/office/word/2006/wordml" xmlns:wps="http://schemas.microsoft.com/office/word/2010/wordprocessingShape" mc:Ignorable="w14 w15 w16se w16cid w16 w16cex w16sdtdh w16sdtfl w16du wp14">
+  <w:p>
+    <w:pPr>
+      <w:pStyle w:val="Footer"/>
+    </w:pPr>
+  </w:p>
+</w:ftr>
+</file>
+
 <file path=word/footnotes.xml><?xml version="1.0" encoding="utf-8"?>
 <w:footnotes xmlns:wpc="http://schemas.microsoft.com/office/word/2010/wordprocessingCanvas" xmlns:cx="http://schemas.microsoft.com/office/drawing/2014/chartex" xmlns:cx1="http://schemas.microsoft.com/office/drawing/2015/9/8/chartex" xmlns:cx2="http://schemas.microsoft.com/office/drawing/2015/10/21/chartex" xmlns:cx3="http://schemas.microsoft.com/office/drawing/2016/5/9/chartex" xmlns:cx4="http://schemas.microsoft.com/office/drawing/2016/5/10/chartex" xmlns:cx5="http://schemas.microsoft.com/office/drawing/2016/5/11/chartex" xmlns:cx6="http://schemas.microsoft.com/office/drawing/2016/5/12/chartex" xmlns:cx7="http://schemas.microsoft.com/office/drawing/2016/5/13/chartex" xmlns:cx8="http://schemas.microsoft.com/office/drawing/2016/5/14/chartex" xmlns:mc="http://schemas.openxmlformats.org/markup-compatibility/2006" xmlns:aink="http://schemas.microsoft.com/office/drawing/2016/ink" xmlns:am3d="http://schemas.microsoft.com/office/drawing/2017/model3d" xmlns:o="urn:schemas-microsoft-com:office:office" xmlns:oel="http://schemas.microsoft.com/office/2019/extlst" xmlns:r="http://schemas.openxmlformats.org/officeDocument/2006/relationships" xmlns:m="http://schemas.openxmlformats.org/officeDocument/2006/math" xmlns:v="urn:schemas-microsoft-com:vml" xmlns:wp14="http://schemas.microsoft.com/office/word/2010/wordprocessingDrawing" xmlns:wp="http://schemas.openxmlformats.org/drawingml/2006/wordprocessingDrawing" xmlns:w10="urn:schemas-microsoft-com:office:word" xmlns:w="http://schemas.openxmlformats.org/wordprocessingml/2006/main" xmlns:w14="http://schemas.microsoft.com/office/word/2010/wordml" xmlns:w15="http://schemas.microsoft.com/office/word/2012/wordml" xmlns:w16cex="http://schemas.microsoft.com/office/word/2018/wordml/cex" xmlns:w16cid="http://schemas.microsoft.com/office/word/2016/wordml/cid" xmlns:w16="http://schemas.microsoft.com/office/word/2018/wordml" xmlns:w16du="http://schemas.microsoft.com/office/word/2023/wordml/word16du" xmlns:w16sdtdh="http://schemas.microsoft.com/office/word/2020/wordml/sdtdatahash" xmlns:w16sdtfl="http://schemas.microsoft.com/office/word/2024/wordml/sdtformatlock" xmlns:w16se="http://schemas.microsoft.com/office/word/2015/wordml/symex" xmlns:wpg="http://schemas.microsoft.com/office/word/2010/wordprocessingGroup" xmlns:wpi="http://schemas.microsoft.com/office/word/2010/wordprocessingInk" xmlns:wne="http://schemas.microsoft.com/office/word/2006/wordml" xmlns:wps="http://schemas.microsoft.com/office/word/2010/wordprocessingShape" mc:Ignorable="w14 w15 w16se w16cid w16 w16cex w16sdtdh w16sdtfl w16du wp14">
   <w:footnote w:type="separator" w:id="-1">
@@ -474,6 +727,16 @@
 </file>
 
 <file path=word/header1.xml><?xml version="1.0" encoding="utf-8"?>
+<w:hdr xmlns:wpc="http://schemas.microsoft.com/office/word/2010/wordprocessingCanvas" xmlns:cx="http://schemas.microsoft.com/office/drawing/2014/chartex" xmlns:cx1="http://schemas.microsoft.com/office/drawing/2015/9/8/chartex" xmlns:cx2="http://schemas.microsoft.com/office/drawing/2015/10/21/chartex" xmlns:cx3="http://schemas.microsoft.com/office/drawing/2016/5/9/chartex" xmlns:cx4="http://schemas.microsoft.com/office/drawing/2016/5/10/chartex" xmlns:cx5="http://schemas.microsoft.com/office/drawing/2016/5/11/chartex" xmlns:cx6="http://schemas.microsoft.com/office/drawing/2016/5/12/chartex" xmlns:cx7="http://schemas.microsoft.com/office/drawing/2016/5/13/chartex" xmlns:cx8="http://schemas.microsoft.com/office/drawing/2016/5/14/chartex" xmlns:mc="http://schemas.openxmlformats.org/markup-compatibility/2006" xmlns:aink="http://schemas.microsoft.com/office/drawing/2016/ink" xmlns:am3d="http://schemas.microsoft.com/office/drawing/2017/model3d" xmlns:o="urn:schemas-microsoft-com:office:office" xmlns:oel="http://schemas.microsoft.com/office/2019/extlst" xmlns:r="http://schemas.openxmlformats.org/officeDocument/2006/relationships" xmlns:m="http://schemas.openxmlformats.org/officeDocument/2006/math" xmlns:v="urn:schemas-microsoft-com:vml" xmlns:wp14="http://schemas.microsoft.com/office/word/2010/wordprocessingDrawing" xmlns:wp="http://schemas.openxmlformats.org/drawingml/2006/wordprocessingDrawing" xmlns:w10="urn:schemas-microsoft-com:office:word" xmlns:w="http://schemas.openxmlformats.org/wordprocessingml/2006/main" xmlns:w14="http://schemas.microsoft.com/office/word/2010/wordml" xmlns:w15="http://schemas.microsoft.com/office/word/2012/wordml" xmlns:w16cex="http://schemas.microsoft.com/office/word/2018/wordml/cex" xmlns:w16cid="http://schemas.microsoft.com/office/word/2016/wordml/cid" xmlns:w16="http://schemas.microsoft.com/office/word/2018/wordml" xmlns:w16du="http://schemas.microsoft.com/office/word/2023/wordml/word16du" xmlns:w16sdtdh="http://schemas.microsoft.com/office/word/2020/wordml/sdtdatahash" xmlns:w16sdtfl="http://schemas.microsoft.com/office/word/2024/wordml/sdtformatlock" xmlns:w16se="http://schemas.microsoft.com/office/word/2015/wordml/symex" xmlns:wpg="http://schemas.microsoft.com/office/word/2010/wordprocessingGroup" xmlns:wpi="http://schemas.microsoft.com/office/word/2010/wordprocessingInk" xmlns:wne="http://schemas.microsoft.com/office/word/2006/wordml" xmlns:wps="http://schemas.microsoft.com/office/word/2010/wordprocessingShape" mc:Ignorable="w14 w15 w16se w16cid w16 w16cex w16sdtdh w16sdtfl w16du wp14">
+  <w:p>
+    <w:pPr>
+      <w:pStyle w:val="Header"/>
+    </w:pPr>
+  </w:p>
+</w:hdr>
+</file>
+
+<file path=word/header2.xml><?xml version="1.0" encoding="utf-8"?>
 <w:hdr xmlns:wpc="http://schemas.microsoft.com/office/word/2010/wordprocessingCanvas" xmlns:cx="http://schemas.microsoft.com/office/drawing/2014/chartex" xmlns:cx1="http://schemas.microsoft.com/office/drawing/2015/9/8/chartex" xmlns:cx2="http://schemas.microsoft.com/office/drawing/2015/10/21/chartex" xmlns:cx3="http://schemas.microsoft.com/office/drawing/2016/5/9/chartex" xmlns:cx4="http://schemas.microsoft.com/office/drawing/2016/5/10/chartex" xmlns:cx5="http://schemas.microsoft.com/office/drawing/2016/5/11/chartex" xmlns:cx6="http://schemas.microsoft.com/office/drawing/2016/5/12/chartex" xmlns:cx7="http://schemas.microsoft.com/office/drawing/2016/5/13/chartex" xmlns:cx8="http://schemas.microsoft.com/office/drawing/2016/5/14/chartex" xmlns:mc="http://schemas.openxmlformats.org/markup-compatibility/2006" xmlns:aink="http://schemas.microsoft.com/office/drawing/2016/ink" xmlns:am3d="http://schemas.microsoft.com/office/drawing/2017/model3d" xmlns:o="urn:schemas-microsoft-com:office:office" xmlns:oel="http://schemas.microsoft.com/office/2019/extlst" xmlns:r="http://schemas.openxmlformats.org/officeDocument/2006/relationships" xmlns:m="http://schemas.openxmlformats.org/officeDocument/2006/math" xmlns:v="urn:schemas-microsoft-com:vml" xmlns:wp14="http://schemas.microsoft.com/office/word/2010/wordprocessingDrawing" xmlns:wp="http://schemas.openxmlformats.org/drawingml/2006/wordprocessingDrawing" xmlns:w10="urn:schemas-microsoft-com:office:word" xmlns:w="http://schemas.openxmlformats.org/wordprocessingml/2006/main" xmlns:w14="http://schemas.microsoft.com/office/word/2010/wordml" xmlns:w15="http://schemas.microsoft.com/office/word/2012/wordml" xmlns:w16cex="http://schemas.microsoft.com/office/word/2018/wordml/cex" xmlns:w16cid="http://schemas.microsoft.com/office/word/2016/wordml/cid" xmlns:w16="http://schemas.microsoft.com/office/word/2018/wordml" xmlns:w16du="http://schemas.microsoft.com/office/word/2023/wordml/word16du" xmlns:w16sdtdh="http://schemas.microsoft.com/office/word/2020/wordml/sdtdatahash" xmlns:w16sdtfl="http://schemas.microsoft.com/office/word/2024/wordml/sdtformatlock" xmlns:w16se="http://schemas.microsoft.com/office/word/2015/wordml/symex" xmlns:wpg="http://schemas.microsoft.com/office/word/2010/wordprocessingGroup" xmlns:wpi="http://schemas.microsoft.com/office/word/2010/wordprocessingInk" xmlns:wne="http://schemas.microsoft.com/office/word/2006/wordml" xmlns:wps="http://schemas.microsoft.com/office/word/2010/wordprocessingShape" mc:Ignorable="w14 w15 w16se w16cid w16 w16cex w16sdtdh w16sdtfl w16du wp14">
   <w:p>
     <w:pPr>
@@ -1063,6 +1326,16 @@
       </w:rPr>
       <w:t>prightness</w:t>
     </w:r>
+  </w:p>
+</w:hdr>
+</file>
+
+<file path=word/header3.xml><?xml version="1.0" encoding="utf-8"?>
+<w:hdr xmlns:wpc="http://schemas.microsoft.com/office/word/2010/wordprocessingCanvas" xmlns:cx="http://schemas.microsoft.com/office/drawing/2014/chartex" xmlns:cx1="http://schemas.microsoft.com/office/drawing/2015/9/8/chartex" xmlns:cx2="http://schemas.microsoft.com/office/drawing/2015/10/21/chartex" xmlns:cx3="http://schemas.microsoft.com/office/drawing/2016/5/9/chartex" xmlns:cx4="http://schemas.microsoft.com/office/drawing/2016/5/10/chartex" xmlns:cx5="http://schemas.microsoft.com/office/drawing/2016/5/11/chartex" xmlns:cx6="http://schemas.microsoft.com/office/drawing/2016/5/12/chartex" xmlns:cx7="http://schemas.microsoft.com/office/drawing/2016/5/13/chartex" xmlns:cx8="http://schemas.microsoft.com/office/drawing/2016/5/14/chartex" xmlns:mc="http://schemas.openxmlformats.org/markup-compatibility/2006" xmlns:aink="http://schemas.microsoft.com/office/drawing/2016/ink" xmlns:am3d="http://schemas.microsoft.com/office/drawing/2017/model3d" xmlns:o="urn:schemas-microsoft-com:office:office" xmlns:oel="http://schemas.microsoft.com/office/2019/extlst" xmlns:r="http://schemas.openxmlformats.org/officeDocument/2006/relationships" xmlns:m="http://schemas.openxmlformats.org/officeDocument/2006/math" xmlns:v="urn:schemas-microsoft-com:vml" xmlns:wp14="http://schemas.microsoft.com/office/word/2010/wordprocessingDrawing" xmlns:wp="http://schemas.openxmlformats.org/drawingml/2006/wordprocessingDrawing" xmlns:w10="urn:schemas-microsoft-com:office:word" xmlns:w="http://schemas.openxmlformats.org/wordprocessingml/2006/main" xmlns:w14="http://schemas.microsoft.com/office/word/2010/wordml" xmlns:w15="http://schemas.microsoft.com/office/word/2012/wordml" xmlns:w16cex="http://schemas.microsoft.com/office/word/2018/wordml/cex" xmlns:w16cid="http://schemas.microsoft.com/office/word/2016/wordml/cid" xmlns:w16="http://schemas.microsoft.com/office/word/2018/wordml" xmlns:w16du="http://schemas.microsoft.com/office/word/2023/wordml/word16du" xmlns:w16sdtdh="http://schemas.microsoft.com/office/word/2020/wordml/sdtdatahash" xmlns:w16sdtfl="http://schemas.microsoft.com/office/word/2024/wordml/sdtformatlock" xmlns:w16se="http://schemas.microsoft.com/office/word/2015/wordml/symex" xmlns:wpg="http://schemas.microsoft.com/office/word/2010/wordprocessingGroup" xmlns:wpi="http://schemas.microsoft.com/office/word/2010/wordprocessingInk" xmlns:wne="http://schemas.microsoft.com/office/word/2006/wordml" xmlns:wps="http://schemas.microsoft.com/office/word/2010/wordprocessingShape" mc:Ignorable="w14 w15 w16se w16cid w16 w16cex w16sdtdh w16sdtfl w16du wp14">
+  <w:p>
+    <w:pPr>
+      <w:pStyle w:val="Header"/>
+    </w:pPr>
   </w:p>
 </w:hdr>
 </file>

</xml_diff>

<commit_message>
nothing special just fixing some errors
</commit_message>
<xml_diff>
--- a/bisu_template.docx
+++ b/bisu_template.docx
@@ -19,260 +19,6 @@
           <w:szCs w:val="24"/>
         </w:rPr>
         <w:t>{{TITLE}}</w:t>
-      </w:r>
-    </w:p>
-    <w:p>
-      <w:pPr>
-        <w:rPr>
-          <w:rFonts w:ascii="Arial Narrow" w:hAnsi="Arial Narrow"/>
-          <w:sz w:val="24"/>
-          <w:szCs w:val="24"/>
-        </w:rPr>
-      </w:pPr>
-    </w:p>
-    <w:p>
-      <w:pPr>
-        <w:rPr>
-          <w:rFonts w:ascii="Arial Narrow" w:hAnsi="Arial Narrow"/>
-          <w:sz w:val="24"/>
-          <w:szCs w:val="24"/>
-        </w:rPr>
-      </w:pPr>
-    </w:p>
-    <w:p>
-      <w:pPr>
-        <w:rPr>
-          <w:rFonts w:ascii="Arial Narrow" w:hAnsi="Arial Narrow"/>
-          <w:sz w:val="24"/>
-          <w:szCs w:val="24"/>
-        </w:rPr>
-      </w:pPr>
-    </w:p>
-    <w:p>
-      <w:pPr>
-        <w:rPr>
-          <w:rFonts w:ascii="Arial Narrow" w:hAnsi="Arial Narrow"/>
-          <w:sz w:val="24"/>
-          <w:szCs w:val="24"/>
-        </w:rPr>
-      </w:pPr>
-    </w:p>
-    <w:p>
-      <w:pPr>
-        <w:rPr>
-          <w:rFonts w:ascii="Arial Narrow" w:hAnsi="Arial Narrow"/>
-          <w:sz w:val="24"/>
-          <w:szCs w:val="24"/>
-        </w:rPr>
-      </w:pPr>
-    </w:p>
-    <w:p>
-      <w:pPr>
-        <w:rPr>
-          <w:rFonts w:ascii="Arial Narrow" w:hAnsi="Arial Narrow"/>
-          <w:sz w:val="24"/>
-          <w:szCs w:val="24"/>
-        </w:rPr>
-      </w:pPr>
-    </w:p>
-    <w:p>
-      <w:pPr>
-        <w:rPr>
-          <w:rFonts w:ascii="Arial Narrow" w:hAnsi="Arial Narrow"/>
-          <w:sz w:val="24"/>
-          <w:szCs w:val="24"/>
-        </w:rPr>
-      </w:pPr>
-    </w:p>
-    <w:p>
-      <w:pPr>
-        <w:rPr>
-          <w:rFonts w:ascii="Arial Narrow" w:hAnsi="Arial Narrow"/>
-          <w:sz w:val="24"/>
-          <w:szCs w:val="24"/>
-        </w:rPr>
-      </w:pPr>
-    </w:p>
-    <w:p>
-      <w:pPr>
-        <w:rPr>
-          <w:rFonts w:ascii="Arial Narrow" w:hAnsi="Arial Narrow"/>
-          <w:sz w:val="24"/>
-          <w:szCs w:val="24"/>
-        </w:rPr>
-      </w:pPr>
-    </w:p>
-    <w:p>
-      <w:pPr>
-        <w:rPr>
-          <w:rFonts w:ascii="Arial Narrow" w:hAnsi="Arial Narrow"/>
-          <w:sz w:val="24"/>
-          <w:szCs w:val="24"/>
-        </w:rPr>
-      </w:pPr>
-    </w:p>
-    <w:p>
-      <w:pPr>
-        <w:rPr>
-          <w:rFonts w:ascii="Arial Narrow" w:hAnsi="Arial Narrow"/>
-          <w:sz w:val="24"/>
-          <w:szCs w:val="24"/>
-        </w:rPr>
-      </w:pPr>
-    </w:p>
-    <w:p>
-      <w:pPr>
-        <w:rPr>
-          <w:rFonts w:ascii="Arial Narrow" w:hAnsi="Arial Narrow"/>
-          <w:sz w:val="24"/>
-          <w:szCs w:val="24"/>
-        </w:rPr>
-      </w:pPr>
-    </w:p>
-    <w:p>
-      <w:pPr>
-        <w:rPr>
-          <w:rFonts w:ascii="Arial Narrow" w:hAnsi="Arial Narrow"/>
-          <w:sz w:val="24"/>
-          <w:szCs w:val="24"/>
-        </w:rPr>
-      </w:pPr>
-    </w:p>
-    <w:p>
-      <w:pPr>
-        <w:rPr>
-          <w:rFonts w:ascii="Arial Narrow" w:hAnsi="Arial Narrow"/>
-          <w:sz w:val="24"/>
-          <w:szCs w:val="24"/>
-        </w:rPr>
-      </w:pPr>
-    </w:p>
-    <w:p>
-      <w:pPr>
-        <w:rPr>
-          <w:rFonts w:ascii="Arial Narrow" w:hAnsi="Arial Narrow"/>
-          <w:sz w:val="24"/>
-          <w:szCs w:val="24"/>
-        </w:rPr>
-      </w:pPr>
-    </w:p>
-    <w:p>
-      <w:pPr>
-        <w:rPr>
-          <w:rFonts w:ascii="Arial Narrow" w:hAnsi="Arial Narrow"/>
-          <w:sz w:val="24"/>
-          <w:szCs w:val="24"/>
-        </w:rPr>
-      </w:pPr>
-    </w:p>
-    <w:p>
-      <w:pPr>
-        <w:rPr>
-          <w:rFonts w:ascii="Arial Narrow" w:hAnsi="Arial Narrow"/>
-          <w:sz w:val="24"/>
-          <w:szCs w:val="24"/>
-        </w:rPr>
-      </w:pPr>
-    </w:p>
-    <w:p>
-      <w:pPr>
-        <w:rPr>
-          <w:rFonts w:ascii="Arial Narrow" w:hAnsi="Arial Narrow"/>
-          <w:sz w:val="24"/>
-          <w:szCs w:val="24"/>
-        </w:rPr>
-      </w:pPr>
-    </w:p>
-    <w:p>
-      <w:pPr>
-        <w:rPr>
-          <w:rFonts w:ascii="Arial Narrow" w:hAnsi="Arial Narrow"/>
-          <w:sz w:val="24"/>
-          <w:szCs w:val="24"/>
-        </w:rPr>
-      </w:pPr>
-    </w:p>
-    <w:p>
-      <w:pPr>
-        <w:rPr>
-          <w:rFonts w:ascii="Arial Narrow" w:hAnsi="Arial Narrow"/>
-          <w:sz w:val="24"/>
-          <w:szCs w:val="24"/>
-        </w:rPr>
-      </w:pPr>
-    </w:p>
-    <w:p>
-      <w:pPr>
-        <w:rPr>
-          <w:rFonts w:ascii="Arial Narrow" w:hAnsi="Arial Narrow"/>
-          <w:sz w:val="24"/>
-          <w:szCs w:val="24"/>
-        </w:rPr>
-      </w:pPr>
-    </w:p>
-    <w:p>
-      <w:pPr>
-        <w:rPr>
-          <w:rFonts w:ascii="Arial Narrow" w:hAnsi="Arial Narrow"/>
-          <w:sz w:val="24"/>
-          <w:szCs w:val="24"/>
-        </w:rPr>
-      </w:pPr>
-    </w:p>
-    <w:p>
-      <w:pPr>
-        <w:rPr>
-          <w:rFonts w:ascii="Arial Narrow" w:hAnsi="Arial Narrow"/>
-          <w:sz w:val="24"/>
-          <w:szCs w:val="24"/>
-        </w:rPr>
-      </w:pPr>
-    </w:p>
-    <w:p>
-      <w:pPr>
-        <w:rPr>
-          <w:rFonts w:ascii="Arial Narrow" w:hAnsi="Arial Narrow"/>
-          <w:sz w:val="24"/>
-          <w:szCs w:val="24"/>
-        </w:rPr>
-      </w:pPr>
-    </w:p>
-    <w:p>
-      <w:pPr>
-        <w:rPr>
-          <w:rFonts w:ascii="Arial Narrow" w:hAnsi="Arial Narrow"/>
-          <w:sz w:val="24"/>
-          <w:szCs w:val="24"/>
-        </w:rPr>
-      </w:pPr>
-    </w:p>
-    <w:p>
-      <w:pPr>
-        <w:rPr>
-          <w:rFonts w:ascii="Arial Narrow" w:hAnsi="Arial Narrow"/>
-          <w:sz w:val="24"/>
-          <w:szCs w:val="24"/>
-        </w:rPr>
-      </w:pPr>
-    </w:p>
-    <w:p>
-      <w:pPr>
-        <w:tabs>
-          <w:tab w:val="left" w:pos="7154"/>
-        </w:tabs>
-        <w:rPr>
-          <w:rFonts w:ascii="Arial Narrow" w:hAnsi="Arial Narrow"/>
-          <w:sz w:val="24"/>
-          <w:szCs w:val="24"/>
-        </w:rPr>
-      </w:pPr>
-      <w:r>
-        <w:rPr>
-          <w:rFonts w:ascii="Arial Narrow" w:hAnsi="Arial Narrow"/>
-          <w:sz w:val="24"/>
-          <w:szCs w:val="24"/>
-        </w:rPr>
-        <w:tab/>
       </w:r>
     </w:p>
     <w:sectPr>

</xml_diff>

<commit_message>
fixed download issue in my_downloads
</commit_message>
<xml_diff>
--- a/bisu_template.docx
+++ b/bisu_template.docx
@@ -19,6 +19,260 @@
           <w:szCs w:val="24"/>
         </w:rPr>
         <w:t>{{TITLE}}</w:t>
+      </w:r>
+    </w:p>
+    <w:p>
+      <w:pPr>
+        <w:rPr>
+          <w:rFonts w:ascii="Arial Narrow" w:hAnsi="Arial Narrow"/>
+          <w:sz w:val="24"/>
+          <w:szCs w:val="24"/>
+        </w:rPr>
+      </w:pPr>
+    </w:p>
+    <w:p>
+      <w:pPr>
+        <w:rPr>
+          <w:rFonts w:ascii="Arial Narrow" w:hAnsi="Arial Narrow"/>
+          <w:sz w:val="24"/>
+          <w:szCs w:val="24"/>
+        </w:rPr>
+      </w:pPr>
+    </w:p>
+    <w:p>
+      <w:pPr>
+        <w:rPr>
+          <w:rFonts w:ascii="Arial Narrow" w:hAnsi="Arial Narrow"/>
+          <w:sz w:val="24"/>
+          <w:szCs w:val="24"/>
+        </w:rPr>
+      </w:pPr>
+    </w:p>
+    <w:p>
+      <w:pPr>
+        <w:rPr>
+          <w:rFonts w:ascii="Arial Narrow" w:hAnsi="Arial Narrow"/>
+          <w:sz w:val="24"/>
+          <w:szCs w:val="24"/>
+        </w:rPr>
+      </w:pPr>
+    </w:p>
+    <w:p>
+      <w:pPr>
+        <w:rPr>
+          <w:rFonts w:ascii="Arial Narrow" w:hAnsi="Arial Narrow"/>
+          <w:sz w:val="24"/>
+          <w:szCs w:val="24"/>
+        </w:rPr>
+      </w:pPr>
+    </w:p>
+    <w:p>
+      <w:pPr>
+        <w:rPr>
+          <w:rFonts w:ascii="Arial Narrow" w:hAnsi="Arial Narrow"/>
+          <w:sz w:val="24"/>
+          <w:szCs w:val="24"/>
+        </w:rPr>
+      </w:pPr>
+    </w:p>
+    <w:p>
+      <w:pPr>
+        <w:rPr>
+          <w:rFonts w:ascii="Arial Narrow" w:hAnsi="Arial Narrow"/>
+          <w:sz w:val="24"/>
+          <w:szCs w:val="24"/>
+        </w:rPr>
+      </w:pPr>
+    </w:p>
+    <w:p>
+      <w:pPr>
+        <w:rPr>
+          <w:rFonts w:ascii="Arial Narrow" w:hAnsi="Arial Narrow"/>
+          <w:sz w:val="24"/>
+          <w:szCs w:val="24"/>
+        </w:rPr>
+      </w:pPr>
+    </w:p>
+    <w:p>
+      <w:pPr>
+        <w:rPr>
+          <w:rFonts w:ascii="Arial Narrow" w:hAnsi="Arial Narrow"/>
+          <w:sz w:val="24"/>
+          <w:szCs w:val="24"/>
+        </w:rPr>
+      </w:pPr>
+    </w:p>
+    <w:p>
+      <w:pPr>
+        <w:rPr>
+          <w:rFonts w:ascii="Arial Narrow" w:hAnsi="Arial Narrow"/>
+          <w:sz w:val="24"/>
+          <w:szCs w:val="24"/>
+        </w:rPr>
+      </w:pPr>
+    </w:p>
+    <w:p>
+      <w:pPr>
+        <w:rPr>
+          <w:rFonts w:ascii="Arial Narrow" w:hAnsi="Arial Narrow"/>
+          <w:sz w:val="24"/>
+          <w:szCs w:val="24"/>
+        </w:rPr>
+      </w:pPr>
+    </w:p>
+    <w:p>
+      <w:pPr>
+        <w:rPr>
+          <w:rFonts w:ascii="Arial Narrow" w:hAnsi="Arial Narrow"/>
+          <w:sz w:val="24"/>
+          <w:szCs w:val="24"/>
+        </w:rPr>
+      </w:pPr>
+    </w:p>
+    <w:p>
+      <w:pPr>
+        <w:rPr>
+          <w:rFonts w:ascii="Arial Narrow" w:hAnsi="Arial Narrow"/>
+          <w:sz w:val="24"/>
+          <w:szCs w:val="24"/>
+        </w:rPr>
+      </w:pPr>
+    </w:p>
+    <w:p>
+      <w:pPr>
+        <w:rPr>
+          <w:rFonts w:ascii="Arial Narrow" w:hAnsi="Arial Narrow"/>
+          <w:sz w:val="24"/>
+          <w:szCs w:val="24"/>
+        </w:rPr>
+      </w:pPr>
+    </w:p>
+    <w:p>
+      <w:pPr>
+        <w:rPr>
+          <w:rFonts w:ascii="Arial Narrow" w:hAnsi="Arial Narrow"/>
+          <w:sz w:val="24"/>
+          <w:szCs w:val="24"/>
+        </w:rPr>
+      </w:pPr>
+    </w:p>
+    <w:p>
+      <w:pPr>
+        <w:rPr>
+          <w:rFonts w:ascii="Arial Narrow" w:hAnsi="Arial Narrow"/>
+          <w:sz w:val="24"/>
+          <w:szCs w:val="24"/>
+        </w:rPr>
+      </w:pPr>
+    </w:p>
+    <w:p>
+      <w:pPr>
+        <w:rPr>
+          <w:rFonts w:ascii="Arial Narrow" w:hAnsi="Arial Narrow"/>
+          <w:sz w:val="24"/>
+          <w:szCs w:val="24"/>
+        </w:rPr>
+      </w:pPr>
+    </w:p>
+    <w:p>
+      <w:pPr>
+        <w:rPr>
+          <w:rFonts w:ascii="Arial Narrow" w:hAnsi="Arial Narrow"/>
+          <w:sz w:val="24"/>
+          <w:szCs w:val="24"/>
+        </w:rPr>
+      </w:pPr>
+    </w:p>
+    <w:p>
+      <w:pPr>
+        <w:rPr>
+          <w:rFonts w:ascii="Arial Narrow" w:hAnsi="Arial Narrow"/>
+          <w:sz w:val="24"/>
+          <w:szCs w:val="24"/>
+        </w:rPr>
+      </w:pPr>
+    </w:p>
+    <w:p>
+      <w:pPr>
+        <w:rPr>
+          <w:rFonts w:ascii="Arial Narrow" w:hAnsi="Arial Narrow"/>
+          <w:sz w:val="24"/>
+          <w:szCs w:val="24"/>
+        </w:rPr>
+      </w:pPr>
+    </w:p>
+    <w:p>
+      <w:pPr>
+        <w:rPr>
+          <w:rFonts w:ascii="Arial Narrow" w:hAnsi="Arial Narrow"/>
+          <w:sz w:val="24"/>
+          <w:szCs w:val="24"/>
+        </w:rPr>
+      </w:pPr>
+    </w:p>
+    <w:p>
+      <w:pPr>
+        <w:rPr>
+          <w:rFonts w:ascii="Arial Narrow" w:hAnsi="Arial Narrow"/>
+          <w:sz w:val="24"/>
+          <w:szCs w:val="24"/>
+        </w:rPr>
+      </w:pPr>
+    </w:p>
+    <w:p>
+      <w:pPr>
+        <w:rPr>
+          <w:rFonts w:ascii="Arial Narrow" w:hAnsi="Arial Narrow"/>
+          <w:sz w:val="24"/>
+          <w:szCs w:val="24"/>
+        </w:rPr>
+      </w:pPr>
+    </w:p>
+    <w:p>
+      <w:pPr>
+        <w:rPr>
+          <w:rFonts w:ascii="Arial Narrow" w:hAnsi="Arial Narrow"/>
+          <w:sz w:val="24"/>
+          <w:szCs w:val="24"/>
+        </w:rPr>
+      </w:pPr>
+    </w:p>
+    <w:p>
+      <w:pPr>
+        <w:rPr>
+          <w:rFonts w:ascii="Arial Narrow" w:hAnsi="Arial Narrow"/>
+          <w:sz w:val="24"/>
+          <w:szCs w:val="24"/>
+        </w:rPr>
+      </w:pPr>
+    </w:p>
+    <w:p>
+      <w:pPr>
+        <w:rPr>
+          <w:rFonts w:ascii="Arial Narrow" w:hAnsi="Arial Narrow"/>
+          <w:sz w:val="24"/>
+          <w:szCs w:val="24"/>
+        </w:rPr>
+      </w:pPr>
+    </w:p>
+    <w:p>
+      <w:pPr>
+        <w:tabs>
+          <w:tab w:val="left" w:pos="9916"/>
+        </w:tabs>
+        <w:rPr>
+          <w:rFonts w:ascii="Arial Narrow" w:hAnsi="Arial Narrow"/>
+          <w:sz w:val="24"/>
+          <w:szCs w:val="24"/>
+        </w:rPr>
+      </w:pPr>
+      <w:r>
+        <w:rPr>
+          <w:rFonts w:ascii="Arial Narrow" w:hAnsi="Arial Narrow"/>
+          <w:sz w:val="24"/>
+          <w:szCs w:val="24"/>
+        </w:rPr>
+        <w:tab/>
       </w:r>
     </w:p>
     <w:sectPr>
@@ -91,16 +345,7 @@
         <w:sz w:val="20"/>
         <w:szCs w:val="20"/>
       </w:rPr>
-      <w:t>{{PROGRAM</w:t>
-    </w:r>
-    <w:proofErr w:type="gramStart"/>
-    <w:r>
-      <w:rPr>
-        <w:rFonts w:ascii="Arial Narrow" w:hAnsi="Arial Narrow"/>
-        <w:sz w:val="20"/>
-        <w:szCs w:val="20"/>
-      </w:rPr>
-      <w:t>}}</w:t>
+      <w:t>{{PROGRAM}}</w:t>
     </w:r>
     <w:r>
       <w:rPr>
@@ -116,9 +361,56 @@
         <w:sz w:val="20"/>
         <w:szCs w:val="20"/>
       </w:rPr>
-      <w:t>|</w:t>
+      <w:t xml:space="preserve">|  </w:t>
     </w:r>
-    <w:proofErr w:type="gramEnd"/>
+    <w:r>
+      <w:rPr>
+        <w:rFonts w:ascii="Arial Narrow" w:hAnsi="Arial Narrow"/>
+        <w:sz w:val="20"/>
+        <w:szCs w:val="20"/>
+      </w:rPr>
+      <w:t>{{COURSE_CODE}}</w:t>
+    </w:r>
+    <w:r>
+      <w:rPr>
+        <w:rFonts w:ascii="Arial Narrow" w:hAnsi="Arial Narrow"/>
+        <w:sz w:val="20"/>
+        <w:szCs w:val="20"/>
+      </w:rPr>
+      <w:t xml:space="preserve"> - </w:t>
+    </w:r>
+    <w:r>
+      <w:rPr>
+        <w:rFonts w:ascii="Arial Narrow" w:hAnsi="Arial Narrow"/>
+        <w:sz w:val="20"/>
+        <w:szCs w:val="20"/>
+      </w:rPr>
+      <w:t>{{COURSE_NAME}}</w:t>
+    </w:r>
+    <w:r>
+      <w:rPr>
+        <w:rFonts w:ascii="Arial Narrow" w:hAnsi="Arial Narrow"/>
+        <w:sz w:val="20"/>
+        <w:szCs w:val="20"/>
+      </w:rPr>
+      <w:t xml:space="preserve"> </w:t>
+    </w:r>
+    <w:r>
+      <w:rPr>
+        <w:rFonts w:ascii="Arial Narrow" w:hAnsi="Arial Narrow"/>
+        <w:sz w:val="20"/>
+        <w:szCs w:val="20"/>
+      </w:rPr>
+      <w:t xml:space="preserve">|  </w:t>
+    </w:r>
+    <w:r>
+      <w:rPr>
+        <w:rFonts w:ascii="Arial Narrow" w:hAnsi="Arial Narrow"/>
+        <w:sz w:val="20"/>
+        <w:szCs w:val="20"/>
+      </w:rPr>
+      <w:t>{{SEMESTER}}</w:t>
+    </w:r>
     <w:r>
       <w:rPr>
         <w:rFonts w:ascii="Arial Narrow" w:hAnsi="Arial Narrow"/>
@@ -133,39 +425,6 @@
         <w:sz w:val="20"/>
         <w:szCs w:val="20"/>
       </w:rPr>
-      <w:t>{{COURSE_CODE}}</w:t>
-    </w:r>
-    <w:r>
-      <w:rPr>
-        <w:rFonts w:ascii="Arial Narrow" w:hAnsi="Arial Narrow"/>
-        <w:sz w:val="20"/>
-        <w:szCs w:val="20"/>
-      </w:rPr>
-      <w:t xml:space="preserve"> - </w:t>
-    </w:r>
-    <w:r>
-      <w:rPr>
-        <w:rFonts w:ascii="Arial Narrow" w:hAnsi="Arial Narrow"/>
-        <w:sz w:val="20"/>
-        <w:szCs w:val="20"/>
-      </w:rPr>
-      <w:t>{{COURSE_NAME}}</w:t>
-    </w:r>
-    <w:r>
-      <w:rPr>
-        <w:rFonts w:ascii="Arial Narrow" w:hAnsi="Arial Narrow"/>
-        <w:sz w:val="20"/>
-        <w:szCs w:val="20"/>
-      </w:rPr>
-      <w:t xml:space="preserve"> </w:t>
-    </w:r>
-    <w:proofErr w:type="gramStart"/>
-    <w:r>
-      <w:rPr>
-        <w:rFonts w:ascii="Arial Narrow" w:hAnsi="Arial Narrow"/>
-        <w:sz w:val="20"/>
-        <w:szCs w:val="20"/>
-      </w:rPr>
       <w:t xml:space="preserve">|  </w:t>
     </w:r>
     <w:r>
@@ -174,57 +433,6 @@
         <w:sz w:val="20"/>
         <w:szCs w:val="20"/>
       </w:rPr>
-      <w:t>{</w:t>
-    </w:r>
-    <w:proofErr w:type="gramEnd"/>
-    <w:r>
-      <w:rPr>
-        <w:rFonts w:ascii="Arial Narrow" w:hAnsi="Arial Narrow"/>
-        <w:sz w:val="20"/>
-        <w:szCs w:val="20"/>
-      </w:rPr>
-      <w:t>{SEMESTER</w:t>
-    </w:r>
-    <w:proofErr w:type="gramStart"/>
-    <w:r>
-      <w:rPr>
-        <w:rFonts w:ascii="Arial Narrow" w:hAnsi="Arial Narrow"/>
-        <w:sz w:val="20"/>
-        <w:szCs w:val="20"/>
-      </w:rPr>
-      <w:t>}}</w:t>
-    </w:r>
-    <w:r>
-      <w:rPr>
-        <w:rFonts w:ascii="Arial Narrow" w:hAnsi="Arial Narrow"/>
-        <w:sz w:val="20"/>
-        <w:szCs w:val="20"/>
-      </w:rPr>
-      <w:t xml:space="preserve">  </w:t>
-    </w:r>
-    <w:r>
-      <w:rPr>
-        <w:rFonts w:ascii="Arial Narrow" w:hAnsi="Arial Narrow"/>
-        <w:sz w:val="20"/>
-        <w:szCs w:val="20"/>
-      </w:rPr>
-      <w:t>|</w:t>
-    </w:r>
-    <w:proofErr w:type="gramEnd"/>
-    <w:r>
-      <w:rPr>
-        <w:rFonts w:ascii="Arial Narrow" w:hAnsi="Arial Narrow"/>
-        <w:sz w:val="20"/>
-        <w:szCs w:val="20"/>
-      </w:rPr>
-      <w:t xml:space="preserve">  </w:t>
-    </w:r>
-    <w:r>
-      <w:rPr>
-        <w:rFonts w:ascii="Arial Narrow" w:hAnsi="Arial Narrow"/>
-        <w:sz w:val="20"/>
-        <w:szCs w:val="20"/>
-      </w:rPr>
       <w:t xml:space="preserve">Prepared by: </w:t>
     </w:r>
     <w:r>
@@ -233,16 +441,7 @@
         <w:sz w:val="20"/>
         <w:szCs w:val="20"/>
       </w:rPr>
-      <w:t>{{INSTRUCTOR</w:t>
-    </w:r>
-    <w:proofErr w:type="gramStart"/>
-    <w:r>
-      <w:rPr>
-        <w:rFonts w:ascii="Arial Narrow" w:hAnsi="Arial Narrow"/>
-        <w:sz w:val="20"/>
-        <w:szCs w:val="20"/>
-      </w:rPr>
-      <w:t>}}</w:t>
+      <w:t>{{INSTRUCTOR}}</w:t>
     </w:r>
     <w:r>
       <w:rPr>
@@ -250,16 +449,7 @@
         <w:sz w:val="20"/>
         <w:szCs w:val="20"/>
       </w:rPr>
-      <w:t>|</w:t>
-    </w:r>
-    <w:proofErr w:type="gramEnd"/>
-    <w:r>
-      <w:rPr>
-        <w:rFonts w:ascii="Arial Narrow" w:hAnsi="Arial Narrow"/>
-        <w:sz w:val="20"/>
-        <w:szCs w:val="20"/>
-      </w:rPr>
-      <w:t xml:space="preserve"> </w:t>
+      <w:t xml:space="preserve">| </w:t>
     </w:r>
     <w:sdt>
       <w:sdtPr>
@@ -295,7 +485,7 @@
                 <w:sz w:val="20"/>
                 <w:szCs w:val="20"/>
               </w:rPr>
-              <w:t xml:space="preserve">                                   </w:t>
+              <w:t xml:space="preserve"> </w:t>
             </w:r>
             <w:r>
               <w:rPr>
@@ -826,7 +1016,6 @@
         <w:szCs w:val="20"/>
       </w:rPr>
     </w:pPr>
-    <w:proofErr w:type="spellStart"/>
     <w:r>
       <w:rPr>
         <w:rFonts w:ascii="Arial" w:eastAsia="Arial" w:hAnsi="Arial" w:cs="Arial"/>
@@ -834,37 +1023,7 @@
         <w:sz w:val="20"/>
         <w:szCs w:val="20"/>
       </w:rPr>
-      <w:t>Magsija</w:t>
-    </w:r>
-    <w:proofErr w:type="spellEnd"/>
-    <w:r>
-      <w:rPr>
-        <w:rFonts w:ascii="Arial" w:eastAsia="Arial" w:hAnsi="Arial" w:cs="Arial"/>
-        <w:color w:val="000000"/>
-        <w:sz w:val="20"/>
-        <w:szCs w:val="20"/>
-      </w:rPr>
-      <w:t xml:space="preserve">, </w:t>
-    </w:r>
-    <w:proofErr w:type="spellStart"/>
-    <w:r>
-      <w:rPr>
-        <w:rFonts w:ascii="Arial" w:eastAsia="Arial" w:hAnsi="Arial" w:cs="Arial"/>
-        <w:color w:val="000000"/>
-        <w:sz w:val="20"/>
-        <w:szCs w:val="20"/>
-      </w:rPr>
-      <w:t>Balilihan</w:t>
-    </w:r>
-    <w:proofErr w:type="spellEnd"/>
-    <w:r>
-      <w:rPr>
-        <w:rFonts w:ascii="Arial" w:eastAsia="Arial" w:hAnsi="Arial" w:cs="Arial"/>
-        <w:color w:val="000000"/>
-        <w:sz w:val="20"/>
-        <w:szCs w:val="20"/>
-      </w:rPr>
-      <w:t>, 6342, Bohol, Philippines</w:t>
+      <w:t>Magsija, Balilihan, 6342, Bohol, Philippines</w:t>
     </w:r>
   </w:p>
   <w:p>

</xml_diff>

<commit_message>
CSRF 403 error fixed
</commit_message>
<xml_diff>
--- a/bisu_template.docx
+++ b/bisu_template.docx
@@ -20,252 +20,6 @@
         </w:rPr>
         <w:t>{{TITLE}}</w:t>
       </w:r>
-    </w:p>
-    <w:p>
-      <w:pPr>
-        <w:rPr>
-          <w:rFonts w:ascii="Arial Narrow" w:hAnsi="Arial Narrow"/>
-          <w:sz w:val="24"/>
-          <w:szCs w:val="24"/>
-        </w:rPr>
-      </w:pPr>
-    </w:p>
-    <w:p>
-      <w:pPr>
-        <w:rPr>
-          <w:rFonts w:ascii="Arial Narrow" w:hAnsi="Arial Narrow"/>
-          <w:sz w:val="24"/>
-          <w:szCs w:val="24"/>
-        </w:rPr>
-      </w:pPr>
-    </w:p>
-    <w:p>
-      <w:pPr>
-        <w:rPr>
-          <w:rFonts w:ascii="Arial Narrow" w:hAnsi="Arial Narrow"/>
-          <w:sz w:val="24"/>
-          <w:szCs w:val="24"/>
-        </w:rPr>
-      </w:pPr>
-    </w:p>
-    <w:p>
-      <w:pPr>
-        <w:rPr>
-          <w:rFonts w:ascii="Arial Narrow" w:hAnsi="Arial Narrow"/>
-          <w:sz w:val="24"/>
-          <w:szCs w:val="24"/>
-        </w:rPr>
-      </w:pPr>
-    </w:p>
-    <w:p>
-      <w:pPr>
-        <w:rPr>
-          <w:rFonts w:ascii="Arial Narrow" w:hAnsi="Arial Narrow"/>
-          <w:sz w:val="24"/>
-          <w:szCs w:val="24"/>
-        </w:rPr>
-      </w:pPr>
-    </w:p>
-    <w:p>
-      <w:pPr>
-        <w:rPr>
-          <w:rFonts w:ascii="Arial Narrow" w:hAnsi="Arial Narrow"/>
-          <w:sz w:val="24"/>
-          <w:szCs w:val="24"/>
-        </w:rPr>
-      </w:pPr>
-    </w:p>
-    <w:p>
-      <w:pPr>
-        <w:rPr>
-          <w:rFonts w:ascii="Arial Narrow" w:hAnsi="Arial Narrow"/>
-          <w:sz w:val="24"/>
-          <w:szCs w:val="24"/>
-        </w:rPr>
-      </w:pPr>
-    </w:p>
-    <w:p>
-      <w:pPr>
-        <w:rPr>
-          <w:rFonts w:ascii="Arial Narrow" w:hAnsi="Arial Narrow"/>
-          <w:sz w:val="24"/>
-          <w:szCs w:val="24"/>
-        </w:rPr>
-      </w:pPr>
-    </w:p>
-    <w:p>
-      <w:pPr>
-        <w:rPr>
-          <w:rFonts w:ascii="Arial Narrow" w:hAnsi="Arial Narrow"/>
-          <w:sz w:val="24"/>
-          <w:szCs w:val="24"/>
-        </w:rPr>
-      </w:pPr>
-    </w:p>
-    <w:p>
-      <w:pPr>
-        <w:rPr>
-          <w:rFonts w:ascii="Arial Narrow" w:hAnsi="Arial Narrow"/>
-          <w:sz w:val="24"/>
-          <w:szCs w:val="24"/>
-        </w:rPr>
-      </w:pPr>
-    </w:p>
-    <w:p>
-      <w:pPr>
-        <w:rPr>
-          <w:rFonts w:ascii="Arial Narrow" w:hAnsi="Arial Narrow"/>
-          <w:sz w:val="24"/>
-          <w:szCs w:val="24"/>
-        </w:rPr>
-      </w:pPr>
-    </w:p>
-    <w:p>
-      <w:pPr>
-        <w:rPr>
-          <w:rFonts w:ascii="Arial Narrow" w:hAnsi="Arial Narrow"/>
-          <w:sz w:val="24"/>
-          <w:szCs w:val="24"/>
-        </w:rPr>
-      </w:pPr>
-    </w:p>
-    <w:p>
-      <w:pPr>
-        <w:rPr>
-          <w:rFonts w:ascii="Arial Narrow" w:hAnsi="Arial Narrow"/>
-          <w:sz w:val="24"/>
-          <w:szCs w:val="24"/>
-        </w:rPr>
-      </w:pPr>
-    </w:p>
-    <w:p>
-      <w:pPr>
-        <w:rPr>
-          <w:rFonts w:ascii="Arial Narrow" w:hAnsi="Arial Narrow"/>
-          <w:sz w:val="24"/>
-          <w:szCs w:val="24"/>
-        </w:rPr>
-      </w:pPr>
-    </w:p>
-    <w:p>
-      <w:pPr>
-        <w:rPr>
-          <w:rFonts w:ascii="Arial Narrow" w:hAnsi="Arial Narrow"/>
-          <w:sz w:val="24"/>
-          <w:szCs w:val="24"/>
-        </w:rPr>
-      </w:pPr>
-    </w:p>
-    <w:p>
-      <w:pPr>
-        <w:rPr>
-          <w:rFonts w:ascii="Arial Narrow" w:hAnsi="Arial Narrow"/>
-          <w:sz w:val="24"/>
-          <w:szCs w:val="24"/>
-        </w:rPr>
-      </w:pPr>
-    </w:p>
-    <w:p>
-      <w:pPr>
-        <w:rPr>
-          <w:rFonts w:ascii="Arial Narrow" w:hAnsi="Arial Narrow"/>
-          <w:sz w:val="24"/>
-          <w:szCs w:val="24"/>
-        </w:rPr>
-      </w:pPr>
-    </w:p>
-    <w:p>
-      <w:pPr>
-        <w:rPr>
-          <w:rFonts w:ascii="Arial Narrow" w:hAnsi="Arial Narrow"/>
-          <w:sz w:val="24"/>
-          <w:szCs w:val="24"/>
-        </w:rPr>
-      </w:pPr>
-    </w:p>
-    <w:p>
-      <w:pPr>
-        <w:rPr>
-          <w:rFonts w:ascii="Arial Narrow" w:hAnsi="Arial Narrow"/>
-          <w:sz w:val="24"/>
-          <w:szCs w:val="24"/>
-        </w:rPr>
-      </w:pPr>
-    </w:p>
-    <w:p>
-      <w:pPr>
-        <w:rPr>
-          <w:rFonts w:ascii="Arial Narrow" w:hAnsi="Arial Narrow"/>
-          <w:sz w:val="24"/>
-          <w:szCs w:val="24"/>
-        </w:rPr>
-      </w:pPr>
-    </w:p>
-    <w:p>
-      <w:pPr>
-        <w:rPr>
-          <w:rFonts w:ascii="Arial Narrow" w:hAnsi="Arial Narrow"/>
-          <w:sz w:val="24"/>
-          <w:szCs w:val="24"/>
-        </w:rPr>
-      </w:pPr>
-    </w:p>
-    <w:p>
-      <w:pPr>
-        <w:rPr>
-          <w:rFonts w:ascii="Arial Narrow" w:hAnsi="Arial Narrow"/>
-          <w:sz w:val="24"/>
-          <w:szCs w:val="24"/>
-        </w:rPr>
-      </w:pPr>
-    </w:p>
-    <w:p>
-      <w:pPr>
-        <w:rPr>
-          <w:rFonts w:ascii="Arial Narrow" w:hAnsi="Arial Narrow"/>
-          <w:sz w:val="24"/>
-          <w:szCs w:val="24"/>
-        </w:rPr>
-      </w:pPr>
-    </w:p>
-    <w:p>
-      <w:pPr>
-        <w:rPr>
-          <w:rFonts w:ascii="Arial Narrow" w:hAnsi="Arial Narrow"/>
-          <w:sz w:val="24"/>
-          <w:szCs w:val="24"/>
-        </w:rPr>
-      </w:pPr>
-    </w:p>
-    <w:p>
-      <w:pPr>
-        <w:rPr>
-          <w:rFonts w:ascii="Arial Narrow" w:hAnsi="Arial Narrow"/>
-          <w:sz w:val="24"/>
-          <w:szCs w:val="24"/>
-        </w:rPr>
-      </w:pPr>
-    </w:p>
-    <w:p>
-      <w:pPr>
-        <w:rPr>
-          <w:rFonts w:ascii="Arial Narrow" w:hAnsi="Arial Narrow"/>
-          <w:sz w:val="24"/>
-          <w:szCs w:val="24"/>
-        </w:rPr>
-      </w:pPr>
-    </w:p>
-    <w:p>
-      <w:pPr>
-        <w:tabs>
-          <w:tab w:val="left" w:pos="9916"/>
-        </w:tabs>
-        <w:rPr>
-          <w:rFonts w:ascii="Arial Narrow" w:hAnsi="Arial Narrow"/>
-          <w:sz w:val="24"/>
-          <w:szCs w:val="24"/>
-        </w:rPr>
-      </w:pPr>
       <w:r>
         <w:rPr>
           <w:rFonts w:ascii="Arial Narrow" w:hAnsi="Arial Narrow"/>
@@ -345,7 +99,16 @@
         <w:sz w:val="20"/>
         <w:szCs w:val="20"/>
       </w:rPr>
-      <w:t>{{PROGRAM}}</w:t>
+      <w:t>{{PROGRAM</w:t>
+    </w:r>
+    <w:proofErr w:type="gramStart"/>
+    <w:r>
+      <w:rPr>
+        <w:rFonts w:ascii="Arial Narrow" w:hAnsi="Arial Narrow"/>
+        <w:sz w:val="20"/>
+        <w:szCs w:val="20"/>
+      </w:rPr>
+      <w:t>}}</w:t>
     </w:r>
     <w:r>
       <w:rPr>
@@ -361,6 +124,56 @@
         <w:sz w:val="20"/>
         <w:szCs w:val="20"/>
       </w:rPr>
+      <w:t>|</w:t>
+    </w:r>
+    <w:proofErr w:type="gramEnd"/>
+    <w:r>
+      <w:rPr>
+        <w:rFonts w:ascii="Arial Narrow" w:hAnsi="Arial Narrow"/>
+        <w:sz w:val="20"/>
+        <w:szCs w:val="20"/>
+      </w:rPr>
+      <w:t xml:space="preserve">  </w:t>
+    </w:r>
+    <w:r>
+      <w:rPr>
+        <w:rFonts w:ascii="Arial Narrow" w:hAnsi="Arial Narrow"/>
+        <w:sz w:val="20"/>
+        <w:szCs w:val="20"/>
+      </w:rPr>
+      <w:t>{{COURSE_CODE}}</w:t>
+    </w:r>
+    <w:r>
+      <w:rPr>
+        <w:rFonts w:ascii="Arial Narrow" w:hAnsi="Arial Narrow"/>
+        <w:sz w:val="20"/>
+        <w:szCs w:val="20"/>
+      </w:rPr>
+      <w:t xml:space="preserve"> - </w:t>
+    </w:r>
+    <w:r>
+      <w:rPr>
+        <w:rFonts w:ascii="Arial Narrow" w:hAnsi="Arial Narrow"/>
+        <w:sz w:val="20"/>
+        <w:szCs w:val="20"/>
+      </w:rPr>
+      <w:t>{{COURSE_NAME}}</w:t>
+    </w:r>
+    <w:r>
+      <w:rPr>
+        <w:rFonts w:ascii="Arial Narrow" w:hAnsi="Arial Narrow"/>
+        <w:sz w:val="20"/>
+        <w:szCs w:val="20"/>
+      </w:rPr>
+      <w:t xml:space="preserve"> </w:t>
+    </w:r>
+    <w:proofErr w:type="gramStart"/>
+    <w:r>
+      <w:rPr>
+        <w:rFonts w:ascii="Arial Narrow" w:hAnsi="Arial Narrow"/>
+        <w:sz w:val="20"/>
+        <w:szCs w:val="20"/>
+      </w:rPr>
       <w:t xml:space="preserve">|  </w:t>
     </w:r>
     <w:r>
@@ -369,47 +182,25 @@
         <w:sz w:val="20"/>
         <w:szCs w:val="20"/>
       </w:rPr>
-      <w:t>{{COURSE_CODE}}</w:t>
+      <w:t>{</w:t>
     </w:r>
+    <w:proofErr w:type="gramEnd"/>
     <w:r>
       <w:rPr>
         <w:rFonts w:ascii="Arial Narrow" w:hAnsi="Arial Narrow"/>
         <w:sz w:val="20"/>
         <w:szCs w:val="20"/>
       </w:rPr>
-      <w:t xml:space="preserve"> - </w:t>
+      <w:t>{SEMESTER</w:t>
     </w:r>
+    <w:proofErr w:type="gramStart"/>
     <w:r>
       <w:rPr>
         <w:rFonts w:ascii="Arial Narrow" w:hAnsi="Arial Narrow"/>
         <w:sz w:val="20"/>
         <w:szCs w:val="20"/>
       </w:rPr>
-      <w:t>{{COURSE_NAME}}</w:t>
-    </w:r>
-    <w:r>
-      <w:rPr>
-        <w:rFonts w:ascii="Arial Narrow" w:hAnsi="Arial Narrow"/>
-        <w:sz w:val="20"/>
-        <w:szCs w:val="20"/>
-      </w:rPr>
-      <w:t xml:space="preserve"> </w:t>
-    </w:r>
-    <w:r>
-      <w:rPr>
-        <w:rFonts w:ascii="Arial Narrow" w:hAnsi="Arial Narrow"/>
-        <w:sz w:val="20"/>
-        <w:szCs w:val="20"/>
-      </w:rPr>
-      <w:t xml:space="preserve">|  </w:t>
-    </w:r>
-    <w:r>
-      <w:rPr>
-        <w:rFonts w:ascii="Arial Narrow" w:hAnsi="Arial Narrow"/>
-        <w:sz w:val="20"/>
-        <w:szCs w:val="20"/>
-      </w:rPr>
-      <w:t>{{SEMESTER}}</w:t>
+      <w:t>}}</w:t>
     </w:r>
     <w:r>
       <w:rPr>
@@ -425,7 +216,16 @@
         <w:sz w:val="20"/>
         <w:szCs w:val="20"/>
       </w:rPr>
-      <w:t xml:space="preserve">|  </w:t>
+      <w:t>|</w:t>
+    </w:r>
+    <w:proofErr w:type="gramEnd"/>
+    <w:r>
+      <w:rPr>
+        <w:rFonts w:ascii="Arial Narrow" w:hAnsi="Arial Narrow"/>
+        <w:sz w:val="20"/>
+        <w:szCs w:val="20"/>
+      </w:rPr>
+      <w:t xml:space="preserve">  </w:t>
     </w:r>
     <w:r>
       <w:rPr>
@@ -441,7 +241,16 @@
         <w:sz w:val="20"/>
         <w:szCs w:val="20"/>
       </w:rPr>
-      <w:t>{{INSTRUCTOR}}</w:t>
+      <w:t>{{INSTRUCTOR</w:t>
+    </w:r>
+    <w:proofErr w:type="gramStart"/>
+    <w:r>
+      <w:rPr>
+        <w:rFonts w:ascii="Arial Narrow" w:hAnsi="Arial Narrow"/>
+        <w:sz w:val="20"/>
+        <w:szCs w:val="20"/>
+      </w:rPr>
+      <w:t>}}</w:t>
     </w:r>
     <w:r>
       <w:rPr>
@@ -449,7 +258,16 @@
         <w:sz w:val="20"/>
         <w:szCs w:val="20"/>
       </w:rPr>
-      <w:t xml:space="preserve">| </w:t>
+      <w:t>|</w:t>
+    </w:r>
+    <w:proofErr w:type="gramEnd"/>
+    <w:r>
+      <w:rPr>
+        <w:rFonts w:ascii="Arial Narrow" w:hAnsi="Arial Narrow"/>
+        <w:sz w:val="20"/>
+        <w:szCs w:val="20"/>
+      </w:rPr>
+      <w:t xml:space="preserve"> </w:t>
     </w:r>
     <w:sdt>
       <w:sdtPr>
@@ -1016,6 +834,7 @@
         <w:szCs w:val="20"/>
       </w:rPr>
     </w:pPr>
+    <w:proofErr w:type="spellStart"/>
     <w:r>
       <w:rPr>
         <w:rFonts w:ascii="Arial" w:eastAsia="Arial" w:hAnsi="Arial" w:cs="Arial"/>
@@ -1023,7 +842,37 @@
         <w:sz w:val="20"/>
         <w:szCs w:val="20"/>
       </w:rPr>
-      <w:t>Magsija, Balilihan, 6342, Bohol, Philippines</w:t>
+      <w:t>Magsija</w:t>
+    </w:r>
+    <w:proofErr w:type="spellEnd"/>
+    <w:r>
+      <w:rPr>
+        <w:rFonts w:ascii="Arial" w:eastAsia="Arial" w:hAnsi="Arial" w:cs="Arial"/>
+        <w:color w:val="000000"/>
+        <w:sz w:val="20"/>
+        <w:szCs w:val="20"/>
+      </w:rPr>
+      <w:t xml:space="preserve">, </w:t>
+    </w:r>
+    <w:proofErr w:type="spellStart"/>
+    <w:r>
+      <w:rPr>
+        <w:rFonts w:ascii="Arial" w:eastAsia="Arial" w:hAnsi="Arial" w:cs="Arial"/>
+        <w:color w:val="000000"/>
+        <w:sz w:val="20"/>
+        <w:szCs w:val="20"/>
+      </w:rPr>
+      <w:t>Balilihan</w:t>
+    </w:r>
+    <w:proofErr w:type="spellEnd"/>
+    <w:r>
+      <w:rPr>
+        <w:rFonts w:ascii="Arial" w:eastAsia="Arial" w:hAnsi="Arial" w:cs="Arial"/>
+        <w:color w:val="000000"/>
+        <w:sz w:val="20"/>
+        <w:szCs w:val="20"/>
+      </w:rPr>
+      <w:t>, 6342, Bohol, Philippines</w:t>
     </w:r>
   </w:p>
   <w:p>

</xml_diff>